<commit_message>
Revise introduction and make DOCX generation optional
</commit_message>
<xml_diff>
--- a/odisea_book.docx
+++ b/odisea_book.docx
@@ -44,21 +44,21 @@
         </w:p>
       </w:sdtContent>
     </w:sdt>
-    <w:bookmarkStart w:id="14" w:name="el-cine-teme-a-homero"/>
+    <w:bookmarkStart w:id="11" w:name="de-libros-y-cine"/>
     <w:p>
       <w:pPr>
         <w:pStyle w:val="Heading1"/>
       </w:pPr>
       <w:r>
-        <w:t xml:space="preserve">El cine teme a Homero</w:t>
-      </w:r>
-    </w:p>
-    <w:p>
-      <w:pPr>
-        <w:pStyle w:val="FirstParagraph"/>
-      </w:pPr>
-      <w:r>
-        <w:t xml:space="preserve">Para mi decimoquinto cumpleaños mi padre me había prometido un «regalo que te va a gustar» y yo sospechaba que sería un libro, porque los regalos de mi padre siempre eran libros.</w:t>
+        <w:t xml:space="preserve">De libros y cine</w:t>
+      </w:r>
+    </w:p>
+    <w:p>
+      <w:pPr>
+        <w:pStyle w:val="FirstParagraph"/>
+      </w:pPr>
+      <w:r>
+        <w:t xml:space="preserve">En julio de 1982, yo acababa de terminar el cuarto curso de la licenciatura en Ciencias Físicas y había ganado una beca para hacer prácticas de verano en la central nuclear de Cofrentes, por entonces todavía en construcción. Las prácticas empezaban en unos pocos días y aquella mañana regresaba de las oficinas de Hidroeléctrica (hoy Iberdrola) en Valencia, donde había firmado el primer contrato de mi vida laboral. De camino a mi piso de estudiantes, me entretuve en una de las librerías universitarias cercanas a Blasco Ibáñez, con el ánimo de hacerme con una buena novela para entretenerme durante los viajes entre Requena (donde estaba previsto que me alojara) y Cofrentes. Entre ambos pueblos había una hora de carretera. No teníamos redes sociales ni teléfonos móviles. Yo leía mucho, es cierto, pero leer no era nada tan extraño en los ochenta. El autobús que tomaría cada día durante los siguientes dos meses iba lleno de trabajadores de todos los oficios: electricistas, mecánicos, oficinistas, ingenieros y estudiantes en prácticas como yo. Y casi todos llevábamos un libro a cuestas para el trayecto.</w:t>
       </w:r>
     </w:p>
     <w:p>
@@ -66,7 +66,7 @@
         <w:pStyle w:val="BodyText"/>
       </w:pPr>
       <w:r>
-        <w:t xml:space="preserve">En lo que se refiere a esos extraños animales, parecidos a ladrillos, con tapas de pasta y cuerpo de papel, yo era un depredador voraz y omnívoro. Devoraba todo lo que caía en mis manos y lo hacía sin contemplaciones, a toda velocidad. Mi capacidad lectora tenía un origen muy claro. Ser hijo de marino y cambiar de ciudad cada pocos años me había condenado a una soledad que mi familia numerosa no acababa de mitigar: al ser el mayor, estaba un poco por delante en edad de las dos chicas que me seguían y a años luz, en la escala de la infancia, de los otros tres chicos. Con pocos amigos y sin móviles, las opciones eran muy reducidas. Mi padre resolvió la situación cuando empezó a comprarme todos los domingos un tebeo (las aventuras del</w:t>
+        <w:t xml:space="preserve">El que casi me asaltó desde el escaparate de la librería aquella mañana fue nada menos que</w:t>
       </w:r>
       <w:r>
         <w:t xml:space="preserve"> </w:t>
@@ -76,16 +76,50 @@
           <w:i/>
           <w:iCs/>
         </w:rPr>
-        <w:t xml:space="preserve">Capitán Trueno</w:t>
-      </w:r>
-      <w:r>
-        <w:t xml:space="preserve">) y un libro de la maravillosa colección «Historias Selección». De ahí pasé a Emilio Salgari, Julio Verne y Mark Twain, sin despreciar las novelas de vaqueros de Marcial Lafuente Estefanía y las novelitas de ciencia ficción que escribían autores como Joe Mogar, a quienes yo suponía gringos y que resultaron ser tan españoles como yo.</w:t>
-      </w:r>
-      <w:r>
-        <w:rPr>
-          <w:rStyle w:val="FootnoteReference"/>
-        </w:rPr>
-        <w:footnoteReference w:id="9"/>
+        <w:t xml:space="preserve">El señor de los anillos</w:t>
+      </w:r>
+      <w:r>
+        <w:t xml:space="preserve">. Eran tres volúmenes, editados por Minotauro, si la memoria aún sirve, y no eran baratos, pero los compré sin vacilar a cuenta de mi primer salario. Había oído hablar de Tolkien, porque alguien había contado una historia de las revueltas estudiantiles del mayo del 68 en París, cuando en el metro aparecían pintadas que afirmaban en rojo vivo sobre las paredes «Frodo vive». Yo no sabía muy bien quién era Frodo ni qué tenía que ver con la revolución, pero cualquier sombra de duda se despejó apenas leí los versos con los que arrancaba la trilogía.</w:t>
+      </w:r>
+    </w:p>
+    <w:p>
+      <w:pPr>
+        <w:pStyle w:val="BlockText"/>
+      </w:pPr>
+      <w:r>
+        <w:t xml:space="preserve">Tres anillos para los reyes elfos bajo el cielo.</w:t>
+      </w:r>
+      <w:r>
+        <w:br/>
+      </w:r>
+      <w:r>
+        <w:t xml:space="preserve">Siete para los señores enanos en palacios de piedra.</w:t>
+      </w:r>
+      <w:r>
+        <w:br/>
+      </w:r>
+      <w:r>
+        <w:t xml:space="preserve">Nueve para los hombres mortales condenados a morir.</w:t>
+      </w:r>
+      <w:r>
+        <w:br/>
+      </w:r>
+      <w:r>
+        <w:t xml:space="preserve">Uno para el señor oscuro, sobre el trono oscuro</w:t>
+      </w:r>
+      <w:r>
+        <w:br/>
+      </w:r>
+      <w:r>
+        <w:t xml:space="preserve">en la tierra de Mordor donde se extienden las sombras.</w:t>
+      </w:r>
+    </w:p>
+    <w:p>
+      <w:pPr>
+        <w:pStyle w:val="FirstParagraph"/>
+      </w:pPr>
+      <w:r>
+        <w:t xml:space="preserve">¿Por qué aquellos versos fueron suficientes para vaciarme los bolsillos y comprometerme con mil páginas de relato épico? Creo que la respuesta tiene que ver con el hecho de que mi cabeza estaba llena de palabras, leídas en las innumerables novelas y libros de poesía que ya había devorado por entonces. Palabras que resonaron con aquellas otras palabras del poema inicial, como un diapasón resuena al sonido de otro.</w:t>
       </w:r>
     </w:p>
     <w:p>
@@ -93,7 +127,7 @@
         <w:pStyle w:val="BodyText"/>
       </w:pPr>
       <w:r>
-        <w:t xml:space="preserve">A los quince años campeaba por la biblioteca de mi padre —aquellas bibliotecas de la humilde y pluriempleada clase media española de los setenta, donde no faltaban las enciclopedias que se pagaban a plazos ni los libros, muy buenos en su mayoría, que el Círculo de Lectores enviaba cada mes— como Atila por el decadente Imperio romano. Solo que la biblioteca de mi padre no era decadente, sino la cueva del tesoro. Los veranos de mi adolescencia se comprimían, como una nave a la velocidad de la luz, en mañanas de playa y tardes tórridas que abarcaban las dos horas de siesta canónica y dos o tres de propina antes de que cediera la canícula. Leer cuatro o cinco horas al día daba para merendarse dos novelas a la semana. A veces mi primo Pedro me llevaba al cine descubierto y veíamos películas que nos interesaban bastante menos que echarnos un Marlboro —robado a mi madre— a escondidas o rondar en elipses concéntricas en torno a Toñi, que era para mí como la perla de Labuán —aunque ella ignoraba mi existencia— y la Aguja, que le había devuelto a mi primo un beso en los labios.</w:t>
+        <w:t xml:space="preserve">Mi primera gran novela, si se me permite la licencia poética, fue la Biblia, en concreto el Antiguo Testamento, en una versión ilustrada para niños que leía en casa de mi tía Corro con seis, quizás siete, años de edad. Era uno de esos libros de antes, de los que llevaban en su catálogo los vendedores ambulantes de enciclopedias, primorosamente encuadernado, con hojas de papel satinado y láminas en color cada pocas páginas. Contaba la historia de un pueblo, protegido por un Dios poderoso, algo arbitrario y no poco cruel, y los episodios eran pura acción y maravilla. Mares que se abrían al paso de las tribus y volvían a cerrarse sobre los ejércitos del faraón, murallas que se derrumbaban al resonar las trompetas, un profeta que hablaba con una zarza ardiente, una divinidad capaz de todo tipo de acciones fabulosas e incomprensibles: pedir a su devoto servidor que matara a su hijo y pararle la mano en el último momento, convertir a una mujer en una estatua de sal, enviar a una banda de ángeles asesinos a que mataran a los primogénitos de los enemigos de su pueblo.</w:t>
       </w:r>
     </w:p>
     <w:p>
@@ -101,15 +135,7 @@
         <w:pStyle w:val="BodyText"/>
       </w:pPr>
       <w:r>
-        <w:t xml:space="preserve">El regalo llegó justo a tiempo para llevarme el enorme volumen a la playa. Me faltó tiempo para mostrárselo a Pedro y los dos pasamos un buen rato admirándolo como quien venera una Biblia, maravillándonos con aquel guerrero griego, lanza en mano, que ocupaba la portada, acariciando el lomo azul, leyendo el título con la solemnidad de quien sabe que, a partir del momento en que nos sumergiéramos en las páginas sagradas, dejaríamos de ser niños para convertirnos en adultos. Peor aún, en poetas.</w:t>
-      </w:r>
-    </w:p>
-    <w:p>
-      <w:pPr>
-        <w:pStyle w:val="BodyText"/>
-      </w:pPr>
-      <w:r>
-        <w:t xml:space="preserve">El libro era la maravillosa versión de la</w:t>
+        <w:t xml:space="preserve">Sin darme cuenta, en casa de mi tía Corro, estaba leyendo mi primera gran épica. No fue la única. Cada domingo, mi padre me compraba un tebeo (las aventuras del Capitán Trueno) y un libro de la colección «Historias Selección», donde descubrí a Robinson Crusoe, a Ben-Hur, a Tom Sawyer, a Nemo, a Uncas y a John Silver, entre otros muchos. A los quince años, cuando mi padre me regaló la</w:t>
       </w:r>
       <w:r>
         <w:t xml:space="preserve"> </w:t>
@@ -141,7 +167,7 @@
         <w:t xml:space="preserve"> </w:t>
       </w:r>
       <w:r>
-        <w:t xml:space="preserve">que el Círculo publicó en 1971. La traducción —¡de 1910, nada menos!— era de Luis Segalá y Estalella, pero ese dato, entonces, se me pasó por alto. Sabía, naturalmente, que el original era un texto griego, pero estaba mucho más interesado en la leyenda del bardo ciego, el Poeta en mayúsculas, que en detalles menores como el hecho de que la versión de Segalá estuviera en prosa, mientras que Homero había escrito en hexámetros dactílicos. Algunos años más tarde leí la</w:t>
+        <w:t xml:space="preserve">—de esa historia hablaré en el próximo capítulo—, yo era ya una máquina de leer. A los veintidós, un libro de trescientas páginas caía en una semana, dos a lo sumo. Los tres volúmenes de</w:t>
       </w:r>
       <w:r>
         <w:t xml:space="preserve"> </w:t>
@@ -151,38 +177,13 @@
           <w:i/>
           <w:iCs/>
         </w:rPr>
-        <w:t xml:space="preserve">Eneida</w:t>
-      </w:r>
-      <w:r>
-        <w:t xml:space="preserve">, a lo largo de un verano en el que tampoco faltaron playas mediterráneas. Para mi fortuna, no la leí solo ni en voz baja, sino declamando los versos libres con que Javier de Echave-Sustaeta había traducido a Virgilio. Mi acompañante, cuya memoria no han borrado cuatro décadas de ausencia, me explicó que el gran poeta latino había usado la misma métrica que Homero y que aquellos hexámetros dactílicos, ¡ay!, eran esencialmente intraducibles al castellano. Pero la versión que leíamos frente al mismo mar que habían surcado Odiseo y Eneas parecía conservar toda la poesía del original.</w:t>
-      </w:r>
-    </w:p>
-    <w:p>
-      <w:pPr>
-        <w:pStyle w:val="BlockText"/>
-      </w:pPr>
-      <w:r>
-        <w:t xml:space="preserve">Y ahora canto las armas horrendas del dios Marte</w:t>
-      </w:r>
-      <w:r>
-        <w:br/>
-      </w:r>
-      <w:r>
-        <w:t xml:space="preserve">y al héroe que forzado al destierro por el hado</w:t>
-      </w:r>
-      <w:r>
-        <w:br/>
-      </w:r>
-      <w:r>
-        <w:t xml:space="preserve">fue el primero que desde la ribera de Troya arribó a Italia.</w:t>
-      </w:r>
-    </w:p>
-    <w:p>
-      <w:pPr>
-        <w:pStyle w:val="FirstParagraph"/>
-      </w:pPr>
-      <w:r>
-        <w:t xml:space="preserve">Imagina, querida lectora, amigo lector, ese Mediterráneo del color del vino y declama, mejor aún, grita los versos. Haz que resuenen en la habitación en la que te encuentras, sal al balcón como Antonio en Alejandría y canta a las armas, a los héroes y a los interminables viajes. ¿Sientes la emoción? Bienvenida, bienvenido, al desesperado reino de la poesía.</w:t>
+        <w:t xml:space="preserve">El señor de los anillos</w:t>
+      </w:r>
+      <w:r>
+        <w:t xml:space="preserve"> </w:t>
+      </w:r>
+      <w:r>
+        <w:t xml:space="preserve">no fueron ninguna excepción.</w:t>
       </w:r>
     </w:p>
     <w:p>
@@ -190,23 +191,7 @@
         <w:pStyle w:val="BodyText"/>
       </w:pPr>
       <w:r>
-        <w:t xml:space="preserve">La versión de Segalá era en prosa y no una prosa para pusilánimes. El primer canto arrancaba así:</w:t>
-      </w:r>
-    </w:p>
-    <w:p>
-      <w:pPr>
-        <w:pStyle w:val="BlockText"/>
-      </w:pPr>
-      <w:r>
-        <w:t xml:space="preserve">Háblame, Musa, de aquel varón de multiforme ingenio que, después de destruir la sacra ciudad de Troya, anduvo peregrinando larguísimo tiempo, vio las poblaciones y conoció las costumbres de muchos hombres y padeció en su ánimo gran número de trabajos en su navegación por el ponto, en cuanto procuraba salvar su vida y la vuelta de sus compañeros a la patria. Mas ni aun así pudo librarlos, como deseaba, y todos perecieron por sus propias locuras. ¡Insensatos! Comiéronse las vacas del Sol, hijo de Hiperión; el cual no permitió que les llegara el día del regreso. ¡Oh diosa, hija de Júpiter!: cuéntanos aunque no sea más que una parte de tales cosas.</w:t>
-      </w:r>
-    </w:p>
-    <w:p>
-      <w:pPr>
-        <w:pStyle w:val="FirstParagraph"/>
-      </w:pPr>
-      <w:r>
-        <w:t xml:space="preserve">Si se lee el párrafo de un tirón, el riesgo de sofoco es grande. El texto sonaba grandilocuente y lo era, pero también emocionante y exótico. «Insensatos», le gritaba a mi primo, «comiéronse las vacas del Sol, hijo de Hiperión». Y él respondía en el mismo tono, «¡Oh diosa, hija de Júpiter!: cuéntanos aunque no sea más que una parte de tales cosas», y los dos nos sentíamos bardos y guerreros y amigos de los olímpicos.</w:t>
+        <w:t xml:space="preserve">La trilogía de Peter Jackson llegó veinte años más tarde. Naturalmente, hice cola en el cine para verla y, naturalmente, la he vuelto a ver muchas veces desde entonces. La vi cuando mi hija Irene era un bebé y mi hijo Héctor aún no había nacido, la vi otra vez cuando aún eran tan niños que los abuelos nos reñían por darles sustos con los Nazgûl, y otra vez cuando eran un poco más mayores, y otra vez de adolescentes y otra vez durante la covid y otra vez recientemente. Por culpa del pesado de su padre, mis hijos se saben la trilogía de memoria.</w:t>
       </w:r>
     </w:p>
     <w:p>
@@ -214,7 +199,7 @@
         <w:pStyle w:val="BodyText"/>
       </w:pPr>
       <w:r>
-        <w:t xml:space="preserve">Por uno de aquellos caprichos de los dioses, aquel verano pasaron en el cine la película protagonizada por Kirk Douglas, que dejó de ser Kirk Douglas para siempre y se convirtió en Ulises. Pero el cinemascope no podía competir con nuestra imaginación y la mecha que la había incendiado era el texto escrito. Y una vez que la imaginación escapa, como los vientos de la bolsa de Eolo, ya no hay quien le ponga rienda. Pedro y yo nos pasamos el resto del mes de agosto navegando por el Mar Menor en el balandro diminuto que mi padre y mis tíos habían comprado para la primada. Juro que las sirenas habitaban entonces en la isla del Barón, que Nausícaa se bañaba desnuda en la Perdiguera —aunque quizás su segundo nombre era Ingrid o Helga—, que los casinos de La Manga hervían de lestrigones y que un día, creyendo a su dueño en tierra, abordamos un yate fondeado cerca del club náutico que resultó ser propiedad de un cíclope que salió de la sentina y del que escapamos milagrosamente, no sin recibir antes alguna bofetada.</w:t>
+        <w:t xml:space="preserve">Y sin embargo, ninguno de los dos ha leído los libros.</w:t>
       </w:r>
     </w:p>
     <w:p>
@@ -222,7 +207,7 @@
         <w:pStyle w:val="BodyText"/>
       </w:pPr>
       <w:r>
-        <w:t xml:space="preserve">Todo hay que decirlo, la lectura de la</w:t>
+        <w:t xml:space="preserve">Los libros han estado siempre en casa: la versión española que compré en 1982 y la versión en inglés que compré en una librería de viejo en San Francisco hacia 1989, durante mi posdoctorado en California. Están muy visibles en las estanterías, provocadores y sensuales como las sirenas, con su excelente encuadernación y sus mil páginas de prodigios. En la misma estantería están</w:t>
       </w:r>
       <w:r>
         <w:t xml:space="preserve"> </w:t>
@@ -232,30 +217,10 @@
           <w:i/>
           <w:iCs/>
         </w:rPr>
-        <w:t xml:space="preserve">Odisea</w:t>
-      </w:r>
-      <w:r>
-        <w:t xml:space="preserve"> </w:t>
-      </w:r>
-      <w:r>
-        <w:t xml:space="preserve">me dejó varias cuentas pendientes con Ulises. Nunca le perdoné la crueldad con que masacró a los pretendientes y ejecutó a las esclavas. Tampoco tenía yo tan claro que hubiera sufrido tanto con Calipso o con Circe, de la que, por cierto, me enamoré como un cencerro. Medio siglo más tarde, zanjaría esas cuentas con el héroe (y con la bruja), imaginándolo viejo y consumido por los remordimientos en una Ítaca que ya no era su hogar, pero todavía enamorado y no precisamente de Penélope</w:t>
-      </w:r>
-      <w:r>
-        <w:rPr>
-          <w:rStyle w:val="FootnoteReference"/>
-        </w:rPr>
-        <w:footnoteReference w:id="11"/>
-      </w:r>
-      <w:r>
-        <w:t xml:space="preserve">.</w:t>
-      </w:r>
-    </w:p>
-    <w:p>
-      <w:pPr>
-        <w:pStyle w:val="BodyText"/>
-      </w:pPr>
-      <w:r>
-        <w:t xml:space="preserve">Lo que me lleva al dilema que todo marino debe resolver cuando navega por las procelosas aguas de Homero (o de Virgilio) y tiene que negociar el paso entre la Escila de la fidelidad al texto original y la Caribdis de conseguir que ese texto sea comprensible, mejor aún,</w:t>
+        <w:t xml:space="preserve">Las mil y una noches</w:t>
+      </w:r>
+      <w:r>
+        <w:t xml:space="preserve">, los poemas completos de Czesław Miłosz y los de Raymond Carver,</w:t>
       </w:r>
       <w:r>
         <w:t xml:space="preserve"> </w:t>
@@ -265,21 +230,13 @@
           <w:i/>
           <w:iCs/>
         </w:rPr>
-        <w:t xml:space="preserve">aceptable</w:t>
-      </w:r>
-      <w:r>
-        <w:t xml:space="preserve"> </w:t>
-      </w:r>
-      <w:r>
-        <w:t xml:space="preserve">para sus contemporáneos.</w:t>
-      </w:r>
-    </w:p>
-    <w:p>
-      <w:pPr>
-        <w:pStyle w:val="BodyText"/>
-      </w:pPr>
-      <w:r>
-        <w:t xml:space="preserve">Un ejemplo que todavía hoy me hace sufrir. En la</w:t>
+        <w:t xml:space="preserve">El Aleph</w:t>
+      </w:r>
+      <w:r>
+        <w:t xml:space="preserve"> </w:t>
+      </w:r>
+      <w:r>
+        <w:t xml:space="preserve">de Borges,</w:t>
       </w:r>
       <w:r>
         <w:t xml:space="preserve"> </w:t>
@@ -289,18 +246,13 @@
           <w:i/>
           <w:iCs/>
         </w:rPr>
-        <w:t xml:space="preserve">Ilíada</w:t>
-      </w:r>
-      <w:r>
-        <w:t xml:space="preserve">, que también leí aquel verano, Héctor de Troya, el más noble e insensato de todos los héroes de la literatura huye cuando Aquiles se le echa encima y ambos dan tres vueltas corriendo en torno a las murallas de Troya, antes de que se decida a plantarle cara. Cuando leí aquella escena no daba crédito a mis ojos. ¿Cómo era posible, me preguntaba, que al valeroso general, después de tomar la decisión de enfrentar al semidiós —por honor, obviamente— le entrara el canguelo y saliera por piernas? Llegué incluso a escribir una variante de la historia en la que Héctor no tenía miedo sino que intentaba agotar a Aquiles haciéndole correr, aparentemente sin darse cuenta de que se las estaba viendo con «el de los pies ligeros». Me costó bastantes años y muchas lecturas reconciliarme con el hecho de que Héctor, por noble que fuera, era humano y por tanto podía sentir miedo, como sentiría cualquiera frente a un enemigo invencible y furioso. Y cuando finalmente caí en la cuenta de la humanidad del héroe cuyo nombre lleva mi hijo, me di cuenta también de que Homero me lo había dejado claro desde el principio. El poeta se limita a describir la huida con una compasión enorme, utilizando el símil de la pesadilla, en que ni el perseguidor consigue alcanzar a su presa ni el perseguido escapar del que le acosa. Ni juzga a Aquiles por su saña, ni a Héctor por su miedo.</w:t>
-      </w:r>
-    </w:p>
-    <w:p>
-      <w:pPr>
-        <w:pStyle w:val="BodyText"/>
-      </w:pPr>
-      <w:r>
-        <w:t xml:space="preserve">¿Cómo se traslada eso a la narrativa contemporánea? Si escogemos el cine, como medio de comunicación de masas, no faltan versiones de la</w:t>
+        <w:t xml:space="preserve">Rayuela</w:t>
+      </w:r>
+      <w:r>
+        <w:t xml:space="preserve"> </w:t>
+      </w:r>
+      <w:r>
+        <w:t xml:space="preserve">de Cortázar,</w:t>
       </w:r>
       <w:r>
         <w:t xml:space="preserve"> </w:t>
@@ -310,10 +262,13 @@
           <w:i/>
           <w:iCs/>
         </w:rPr>
-        <w:t xml:space="preserve">Ilíada</w:t>
-      </w:r>
-      <w:r>
-        <w:t xml:space="preserve">. En ninguna, que yo sepa —desde luego no en la «clásica»</w:t>
+        <w:t xml:space="preserve">Ana Karenina</w:t>
+      </w:r>
+      <w:r>
+        <w:t xml:space="preserve"> </w:t>
+      </w:r>
+      <w:r>
+        <w:t xml:space="preserve">de Tolstoi y</w:t>
       </w:r>
       <w:r>
         <w:t xml:space="preserve"> </w:t>
@@ -323,13 +278,13 @@
           <w:i/>
           <w:iCs/>
         </w:rPr>
-        <w:t xml:space="preserve">Troya</w:t>
-      </w:r>
-      <w:r>
-        <w:t xml:space="preserve"> </w:t>
-      </w:r>
-      <w:r>
-        <w:t xml:space="preserve">de Petersen (2004), en la que Eric Bana le planta cara virilmente a Brad Pitt—, aparece la escena de la huida y, en consecuencia, el personaje de Héctor se aleja del original y no para bien. El héroe de Petersen es mucho más cliché que el de Homero (de Aquiles, mejor ni hablamos) y ese cliché se transmite a millones de espectadores.</w:t>
+        <w:t xml:space="preserve">Los desposeídos</w:t>
+      </w:r>
+      <w:r>
+        <w:t xml:space="preserve"> </w:t>
+      </w:r>
+      <w:r>
+        <w:t xml:space="preserve">de Ursula K. Le Guin. Todos esos volúmenes están esperando la misma atención que esperaban los libros de la biblioteca de mi padre. Pero yo, a aquellos, no los decepcioné. Los de la mía esperan en vano a Godot.</w:t>
       </w:r>
     </w:p>
     <w:p>
@@ -337,7 +292,7 @@
         <w:pStyle w:val="BodyText"/>
       </w:pPr>
       <w:r>
-        <w:t xml:space="preserve">Puede alegarse, con razón, que el cine es traducción intersemiótica y, por tanto, en última instancia, interpretación. Es decir,</w:t>
+        <w:t xml:space="preserve">Irene es médica; Héctor, un brillante estudiante de físicas, acabando su máster. Los dos leían de pequeños. Son de la generación de Harry Potter y además en casa no teníamos televisión, así que, durante su niñez, como para su padre antes que ellos, los libros eran un excelente antídoto contra el aburrimiento. Ambos siguen leyendo hoy en día. Irene tiene poco tiempo, pero lo compensa con un extraño sexto sentido para seleccionar novelas interesantes. De hecho, fue ella la que me descubrió a una de mis escritoras favoritas, Elena Ferrante, y leímos juntos, gozosamente, la tetralogía de</w:t>
       </w:r>
       <w:r>
         <w:t xml:space="preserve"> </w:t>
@@ -347,18 +302,10 @@
           <w:i/>
           <w:iCs/>
         </w:rPr>
-        <w:t xml:space="preserve">traduttore, traditore</w:t>
-      </w:r>
-      <w:r>
-        <w:t xml:space="preserve">. Pero ni todas las traducciones son equivalentes, ni todas las traiciones igual de imperdonables.</w:t>
-      </w:r>
-    </w:p>
-    <w:p>
-      <w:pPr>
-        <w:pStyle w:val="BodyText"/>
-      </w:pPr>
-      <w:r>
-        <w:t xml:space="preserve">En una de las escenas más conseguidas de la</w:t>
+        <w:t xml:space="preserve">La amiga estupenda</w:t>
+      </w:r>
+      <w:r>
+        <w:t xml:space="preserve">. Héctor acaba de leer</w:t>
       </w:r>
       <w:r>
         <w:t xml:space="preserve"> </w:t>
@@ -368,13 +315,13 @@
           <w:i/>
           <w:iCs/>
         </w:rPr>
-        <w:t xml:space="preserve">Odisea</w:t>
-      </w:r>
-      <w:r>
-        <w:t xml:space="preserve"> </w:t>
-      </w:r>
-      <w:r>
-        <w:t xml:space="preserve">de Nolan, el rapero Travis Scott interpreta a un bardo que canta la caída de Troya, acompañándose de un bastón con el que golpea rítmicamente el suelo. Hay un elemento a la vez onírico y familiar en ese híbrido entre rap e invocación épica, una conexión intensa entre el rapero negro y el bardo griego que encarna. Nolan no pretende que Travis traduzca (literalmente) a ese bardo. Pretende que lo interprete, que lo devuelva a la vida, que nos haga sentir con su rap lo que sentirían los aqueos escuchando a un poeta itinerante hace tres milenios. Y creo que, en buena medida, lo consigue.</w:t>
+        <w:t xml:space="preserve">La insoportable levedad del ser</w:t>
+      </w:r>
+      <w:r>
+        <w:t xml:space="preserve"> </w:t>
+      </w:r>
+      <w:r>
+        <w:t xml:space="preserve">y los dos hemos pasado muchas horas hablando de la honda, casi inaudita percepción del alma humana que allí ofrece Milan Kundera.</w:t>
       </w:r>
     </w:p>
     <w:p>
@@ -382,7 +329,15 @@
         <w:pStyle w:val="BodyText"/>
       </w:pPr>
       <w:r>
-        <w:t xml:space="preserve">Interpretar la</w:t>
+        <w:t xml:space="preserve">¿Entonces? La diferencia entre mis hijos y yo no es de actitud, ni de interés. La diferencia está en los números. Aunque a ellos las redes sociales les sorprendieron relativamente tarde, no han sido inmunes a un asalto que ha mermado el tiempo de todo el mundo, sobre todo de la gente joven, robándoselo a muchas otras actividades más enriquecedoras para el alma, en particular la lectura. En el mundo en el que yo crecí, la televisión era una receta fija que ocupaba unas pocas horas del día, entre una carta de ajuste que abría a las siete o las ocho de la tarde y cerraba dos horas después de la cena. No había internet y el cine era un lujo reservado a los domingos. No había, por supuesto, TikTok ni Instagram. Yo leía antes de dormir, leía los fines de semana, en vacaciones, durante los viajes, a cualquier hora. No lo hacía por devoción intelectual o por ganar cultura. Lo hacía, a menudo, porque no había nada mejor que hacer. Pero una infancia y una adolescencia de lecturas a destajo construyen un vocabulario y una imaginería a la que uno ya no puede sustraerse.</w:t>
+      </w:r>
+    </w:p>
+    <w:p>
+      <w:pPr>
+        <w:pStyle w:val="BodyText"/>
+      </w:pPr>
+      <w:r>
+        <w:t xml:space="preserve">Los elfos de</w:t>
       </w:r>
       <w:r>
         <w:t xml:space="preserve"> </w:t>
@@ -392,13 +347,10 @@
           <w:i/>
           <w:iCs/>
         </w:rPr>
-        <w:t xml:space="preserve">Odisea</w:t>
-      </w:r>
-      <w:r>
-        <w:t xml:space="preserve"> </w:t>
-      </w:r>
-      <w:r>
-        <w:t xml:space="preserve">en clave cinematográfica requiere no poca osadía, más aún teniendo en cuenta que muchos otros cineastas lo han intentado antes. Y quizás ese sea mi mayor problema con la versión de Nolan. A pesar de su bardo rapero, a pesar de la habilidad con que quita de en medio a los dioses —excepto a una onírica Atenea—, a pesar de elipsis muy inteligentes, como la que nos permite escuchar, pero no ver, a las sirenas, o de opciones arriesgadas y elegantes como escoger a Lupita Nyong’o para interpretar a Helena —si Homero hubiera coincidido con la actriz, quizás nos habría legado «Helena la de los brazos de ébano» en lugar de «Helena la de blancos brazos»—, a la película, creo, le pasa lo mismo que a Héctor. Tiene miedo, en este caso no a Aquiles, sino al mismísimo Homero.</w:t>
+        <w:t xml:space="preserve">El señor de los anillos</w:t>
+      </w:r>
+      <w:r>
+        <w:t xml:space="preserve">, los enanos y los orcos, los Rohirrim, las temibles batallas del Abismo de Helm y el viaje final de Frodo por Mordor se formaron en mi mente antes de ver una sola imagen en la pantalla. Para mis hijos y para casi todos los jóvenes del planeta, todos esos seres fantásticos, todas esas tierras misteriosas son las que Peter Jackson imaginó. En tiempos de libros, había tantos elfos como lectores. Hoy en día, Galadriel tiene el rostro de Cate Blanchett, Arwen es Liv Tyler, Frodo es Elijah Wood. Nada que objetar, todos ellos son magníficas encarnaciones de los personajes de la leyenda. Pero cuando el verbo se hace carne, irremediablemente, pierde parte de su carácter divino.</w:t>
       </w:r>
     </w:p>
     <w:p>
@@ -406,7 +358,7 @@
         <w:pStyle w:val="BodyText"/>
       </w:pPr>
       <w:r>
-        <w:t xml:space="preserve">Los ejemplos abundan, empezando por la misma Helena, que en la película tiene el rostro marcado por una cicatriz que le infligió el vengativo Menelao, con toda la carga de violencia machista que ello implica. Pero se da la circunstancia de que el texto de la</w:t>
+        <w:t xml:space="preserve">Mis hijos, como muchos jóvenes en la franja entre los veinte y los treinta años, han leído menos que sus padres, pero la lectura ha estado y sigue estando presente en sus vidas. Ahora bien, los jóvenes de menos edad, en su mayoría, no leen nada que no esté en los</w:t>
       </w:r>
       <w:r>
         <w:t xml:space="preserve"> </w:t>
@@ -416,7 +368,13 @@
           <w:i/>
           <w:iCs/>
         </w:rPr>
-        <w:t xml:space="preserve">Odisea</w:t>
+        <w:t xml:space="preserve">feeds</w:t>
+      </w:r>
+      <w:r>
+        <w:t xml:space="preserve"> </w:t>
+      </w:r>
+      <w:r>
+        <w:t xml:space="preserve">de sus redes sociales. Y no solo ellos. Cada vez hay menos gente que abre un libro y, entre quienes lo hacen, el hábito es cada vez más infrecuente. Es un secreto a voces que la capacidad de comprender un texto complejo se ha desplomado entre los jóvenes. No menos sabido es el hecho de que su vocabulario se ha reducido. Y si combinamos ambas cosas, el resultado inevitable es una generación con menos recursos expresivos, menos capacidad analítica, menos instrumentos de raciocinio. O, en otras palabras, una generación de jóvenes con menos capacidad para pensar por sí mismos, por tanto, quizás más crédulos, menos críticos, más fáciles de manipular, más susceptibles a las estafas del populismo, las teorías de la conspiración o la demoledora tontería de los</w:t>
       </w:r>
       <w:r>
         <w:t xml:space="preserve"> </w:t>
@@ -426,13 +384,38 @@
           <w:i/>
           <w:iCs/>
         </w:rPr>
-        <w:t xml:space="preserve">contradice</w:t>
-      </w:r>
-      <w:r>
-        <w:t xml:space="preserve"> </w:t>
-      </w:r>
-      <w:r>
-        <w:t xml:space="preserve">esa lectura. En el poema, cuando Telémaco llega a Esparta encuentra a Helena radiante y a sus anchas. Otros textos clásicos, de hecho, explican que toda la furia asesina de Menelao se disuelve cuando su mujer adúltera le muestra el pecho invitándole a matarla. Lejos de hacerlo, tira la espada y la lleva de vuelta a casa.</w:t>
+        <w:t xml:space="preserve">influencers</w:t>
+      </w:r>
+      <w:r>
+        <w:t xml:space="preserve">. La lectura, me temo, no es un lujo de señoritos, sino, como decía Gabriel Celaya de la poesía, un arma cargada de futuro. Los versos de Miguel Hernández anunciaban:</w:t>
+      </w:r>
+    </w:p>
+    <w:p>
+      <w:pPr>
+        <w:pStyle w:val="BlockText"/>
+      </w:pPr>
+      <w:r>
+        <w:t xml:space="preserve">Tristes armas</w:t>
+      </w:r>
+      <w:r>
+        <w:br/>
+      </w:r>
+      <w:r>
+        <w:t xml:space="preserve">si no son las palabras.</w:t>
+      </w:r>
+      <w:r>
+        <w:br/>
+      </w:r>
+      <w:r>
+        <w:t xml:space="preserve">Tristes. Tristes.</w:t>
+      </w:r>
+    </w:p>
+    <w:p>
+      <w:pPr>
+        <w:pStyle w:val="FirstParagraph"/>
+      </w:pPr>
+      <w:r>
+        <w:t xml:space="preserve">Y en tiempos iletrados, como los que vivimos, nos han robado las palabras.</w:t>
       </w:r>
     </w:p>
     <w:p>
@@ -440,13 +423,7 @@
         <w:pStyle w:val="BodyText"/>
       </w:pPr>
       <w:r>
-        <w:t xml:space="preserve">Ojo, no es que Homero sea feminista, pacifista o quiera evitarle al lector un mal rato. De hecho, cuando se pone, es un energúmeno.</w:t>
-      </w:r>
-      <w:r>
-        <w:t xml:space="preserve"> </w:t>
-      </w:r>
-      <w:r>
-        <w:t xml:space="preserve">En el canto XXII de la</w:t>
+        <w:t xml:space="preserve">Ahora bien, como afirma Rick Blaine —tan indistinguible de Humphrey Bogart como Aragorn de Viggo Mortensen—, siempre nos quedará París, es decir, el cine. Cierto, mis hijos no han leído</w:t>
       </w:r>
       <w:r>
         <w:t xml:space="preserve"> </w:t>
@@ -456,72 +433,33 @@
           <w:i/>
           <w:iCs/>
         </w:rPr>
-        <w:t xml:space="preserve">Odisea</w:t>
-      </w:r>
-      <w:r>
-        <w:t xml:space="preserve">, Homero nos describe un episodio repugnante, que Nolan se salta a la torera, con la misma cintura con que Petersen se salta la huida de Héctor: acabada la matanza de los pretendientes, las doce esclavas que se habían acostado con ellos son obligadas a limpiar la sangre y luego ahorcadas por Telémaco, que demuestra con semejante salvajada que tampoco es la hermanita de la caridad que dibuja Nolan en su adaptación. Es decir, Homero no tiene problema alguno en castigar con saña a unas pobres criadas por una falta muchísimo menor que la de Helena. Leer a Homero nos dice que al poeta —y por extensión, a la gente de su tiempo— le parecía muy bien que la reina adúltera se fuera de rositas y las esclavas acabaran en la picota.</w:t>
-      </w:r>
-    </w:p>
-    <w:p>
-      <w:pPr>
-        <w:pStyle w:val="BodyText"/>
-      </w:pPr>
-      <w:r>
-        <w:t xml:space="preserve">Todavía hay más. La Helena de Homero no necesita que la castiguen. Ella misma se castiga, se maldice, se llama a sí misma</w:t>
-      </w:r>
-      <w:r>
-        <w:t xml:space="preserve"> </w:t>
-      </w:r>
-      <w:r>
-        <w:rPr>
-          <w:lang w:val="el"/>
-        </w:rPr>
-        <w:t xml:space="preserve">κυνῶπις</w:t>
-      </w:r>
-      <w:r>
-        <w:t xml:space="preserve"> </w:t>
-      </w:r>
-      <w:r>
-        <w:t xml:space="preserve">(</w:t>
+        <w:t xml:space="preserve">El señor de los anillos</w:t>
+      </w:r>
+      <w:r>
+        <w:t xml:space="preserve">, pero podría argumentarse que las películas son tan buenas que una cosa compensa la otra. Y quizás lo mismo ocurre con todas las grandes historias. No hay gran libro, se diría, que no cuente con su versión cinematográfica y, en algunos casos, el celuloide supera de largo a la página escrita.</w:t>
+      </w:r>
+      <w:r>
+        <w:t xml:space="preserve"> </w:t>
       </w:r>
       <w:r>
         <w:rPr>
           <w:i/>
           <w:iCs/>
         </w:rPr>
-        <w:t xml:space="preserve">kynôpis</w:t>
-      </w:r>
-      <w:r>
-        <w:t xml:space="preserve">, cara de perra, desvergonzada). Helena escapa al castigo físico y a la violencia machista por ser noble y bellísima, a diferencia de las infelices esclavas. La única cicatriz que lleva es la del remordimiento. Nolan simplifica todo eso propinándole un tajo en el rostro.</w:t>
-      </w:r>
-    </w:p>
-    <w:p>
-      <w:pPr>
-        <w:pStyle w:val="BodyText"/>
-      </w:pPr>
-      <w:r>
-        <w:t xml:space="preserve">Está en su derecho, claro, y lo digo por experiencia. En mi propia versión del mito de Odiseo, reinterpreto esencialmente toda la vida y la personalidad del héroe. Reescribir al clásico no solo es necesario, es, hasta cierto punto, inevitable. Pero hay que decir que el jaleado director se complica poco la vida: el navajazo en el rostro de la bella es un cliché tan trillado como el fornido Eric Bana plantándole cara sin miedo al no menos fornido Brad Pitt. Y resulta irónico que un texto del siglo VIII a.C. ofrezca una lectura inquietante y subversiva de Helena de Troya —una belleza amoral que sobrevive a la catástrofe que causó— mientras que Nolan ofrece algo mucho más convencional y comercial a la vez, la víctima cuya cicatriz reconocemos y con la que podemos identificarnos. Exactamente igual que hace Petersen. ¿Para qué arriesgarse a que los espectadores crean que Héctor es un cobarde, si podemos suprimir la carrera?</w:t>
-      </w:r>
-    </w:p>
-    <w:p>
-      <w:pPr>
-        <w:pStyle w:val="BodyText"/>
-      </w:pPr>
-      <w:r>
-        <w:t xml:space="preserve">El segundo ejemplo es todavía más grave. En la versión de Nolan, el cíclope es un idiota casi mudo, un personaje mucho menos interesante que el gamberro y malvado Polifemo y la escena correspondiente es pura acción, sin apenas diálogo. En la</w:t>
-      </w:r>
-      <w:r>
-        <w:t xml:space="preserve"> </w:t>
+        <w:t xml:space="preserve">Blade Runner</w:t>
+      </w:r>
+      <w:r>
+        <w:t xml:space="preserve">, por ejemplo, le da vuelta y media a la novela original (</w:t>
       </w:r>
       <w:r>
         <w:rPr>
           <w:i/>
           <w:iCs/>
         </w:rPr>
-        <w:t xml:space="preserve">Odisea</w:t>
-      </w:r>
-      <w:r>
-        <w:t xml:space="preserve">, en cambio, Polifemo es</w:t>
+        <w:t xml:space="preserve">Do Androids Dream of Electric Sheep?</w:t>
+      </w:r>
+      <w:r>
+        <w:t xml:space="preserve">) y la trilogía de</w:t>
       </w:r>
       <w:r>
         <w:t xml:space="preserve"> </w:t>
@@ -531,151 +469,29 @@
           <w:i/>
           <w:iCs/>
         </w:rPr>
-        <w:t xml:space="preserve">casi</w:t>
-      </w:r>
-      <w:r>
-        <w:t xml:space="preserve"> </w:t>
-      </w:r>
-      <w:r>
-        <w:t xml:space="preserve">tan artero como Ulises y empieza fingiendo hospitalidad:</w:t>
-      </w:r>
-    </w:p>
-    <w:p>
-      <w:pPr>
-        <w:pStyle w:val="BlockText"/>
-      </w:pPr>
-      <w:r>
-        <w:rPr>
-          <w:lang w:val="el"/>
-        </w:rPr>
-        <w:t xml:space="preserve">καί μοι τεὸν οὔνομα εἰπὲ αὐτίκα νῦν, ἵνα τοι δῶ</w:t>
-      </w:r>
-      <w:r>
-        <w:br/>
-      </w:r>
-      <w:r>
-        <w:rPr>
-          <w:lang w:val="el"/>
-        </w:rPr>
-        <w:t xml:space="preserve">ξείνιον, ᾧ κε σὺ χαίρῃς·</w:t>
-      </w:r>
-    </w:p>
-    <w:p>
-      <w:pPr>
-        <w:pStyle w:val="BlockText"/>
-      </w:pPr>
-      <w:r>
-        <w:t xml:space="preserve">Y dime tu nombre ahora mismo, para que te dé un regalo de huésped con el que te alegres.</w:t>
-      </w:r>
-      <w:r>
-        <w:rPr>
-          <w:rStyle w:val="FootnoteReference"/>
-        </w:rPr>
-        <w:footnoteReference w:id="13"/>
-      </w:r>
-    </w:p>
-    <w:p>
-      <w:pPr>
-        <w:pStyle w:val="FirstParagraph"/>
-      </w:pPr>
-      <w:r>
-        <w:t xml:space="preserve">El regalo en cuestión no es otro que zamparse a Odiseo el último. Pero Ulises tiene su propio as en la manga y contesta.</w:t>
-      </w:r>
-    </w:p>
-    <w:p>
-      <w:pPr>
-        <w:pStyle w:val="BlockText"/>
-      </w:pPr>
-      <w:r>
-        <w:rPr>
-          <w:lang w:val="el"/>
-        </w:rPr>
-        <w:t xml:space="preserve">Οὖτις ἐμοί γ’ ὄνομα· Οὖτιν δέ με κικλήσκουσι</w:t>
-      </w:r>
-      <w:r>
-        <w:br/>
-      </w:r>
-      <w:r>
-        <w:rPr>
-          <w:lang w:val="el"/>
-        </w:rPr>
-        <w:t xml:space="preserve">μήτηρ ἠδὲ πατὴρ ἠδ’ ἄλλοι πάντες ἑταῖροι.</w:t>
-      </w:r>
-    </w:p>
-    <w:p>
-      <w:pPr>
-        <w:pStyle w:val="BlockText"/>
-      </w:pPr>
-      <w:r>
-        <w:t xml:space="preserve">Nadie es mi nombre; Nadie me llaman mi madre y mi padre y todos los demás compañeros.</w:t>
-      </w:r>
-    </w:p>
-    <w:p>
-      <w:pPr>
-        <w:pStyle w:val="FirstParagraph"/>
-      </w:pPr>
-      <w:r>
-        <w:t xml:space="preserve">Así que, después de que los aqueos lo cieguen, cuando Polifemo pide ayuda a los demás cíclopes y estos le preguntan quién le ataca, contesta:</w:t>
-      </w:r>
-    </w:p>
-    <w:p>
-      <w:pPr>
-        <w:pStyle w:val="BlockText"/>
-      </w:pPr>
-      <w:r>
-        <w:rPr>
-          <w:lang w:val="el"/>
-        </w:rPr>
-        <w:t xml:space="preserve">ὦ φίλοι, Οὖτίς με κτείνει δόλῳ οὐδὲ βίηφιν.</w:t>
-      </w:r>
-    </w:p>
-    <w:p>
-      <w:pPr>
-        <w:pStyle w:val="BlockText"/>
-      </w:pPr>
-      <w:r>
-        <w:t xml:space="preserve">¡Amigos!, Nadie me mata con engaño y no con fuerza.</w:t>
-      </w:r>
-    </w:p>
-    <w:p>
-      <w:pPr>
-        <w:pStyle w:val="FirstParagraph"/>
-      </w:pPr>
-      <w:r>
-        <w:t xml:space="preserve">El problema de la lectura de Nolan, en mi opinión, es triple. Primero, transforma un personaje inteligente y cabal en un imbécil y, al hacerlo, obvia —porque nada podemos esperar de uno que no rige— el hecho de que Polifemo es un anfitrión fallido, casi podríamos decir que el arquetipo del anfitrión fallido, precisamente uno de los ejes temáticos que guían la película. Segundo, al esquivar el engaño de Ulises, pierde la oportunidad de mostrar la característica más sobresaliente del héroe —la astucia— en su momento más brillante. Tercero, vuelve a sustituir la sofisticación de Homero por un cliché. En el poema, «Nadie me mata con engaño y no con fuerza», mientras que en el film, Odiseo le dispara una flecha al Cíclope, esencialmente sustituyendo el engaño —necesario para salvarse— por la fuerza —gratuita además, ya que están a salvo—. En otras palabras, Nolan convierte a</w:t>
-      </w:r>
-      <w:r>
-        <w:t xml:space="preserve"> </w:t>
-      </w:r>
-      <w:r>
-        <w:rPr>
-          <w:lang w:val="el"/>
-        </w:rPr>
-        <w:t xml:space="preserve">πολύτροπος</w:t>
-      </w:r>
-      <w:r>
-        <w:t xml:space="preserve"> </w:t>
-      </w:r>
-      <w:r>
-        <w:t xml:space="preserve">(</w:t>
+        <w:t xml:space="preserve">El padrino</w:t>
+      </w:r>
+      <w:r>
+        <w:t xml:space="preserve"> </w:t>
+      </w:r>
+      <w:r>
+        <w:t xml:space="preserve">reside en una esfera del Parnaso a la que no habrían llegado jamás las novelas de Mario Puzo.</w:t>
+      </w:r>
+      <w:r>
+        <w:t xml:space="preserve"> </w:t>
       </w:r>
       <w:r>
         <w:rPr>
           <w:i/>
           <w:iCs/>
         </w:rPr>
-        <w:t xml:space="preserve">politropos</w:t>
-      </w:r>
-      <w:r>
-        <w:t xml:space="preserve">), el hombre de los mil recursos, en un héroe de acción tan cliché como su Helena. De hecho, Nolan parece empeñado en dejar psicológicamente cojo a Ulises. Le hace avisar a sus potenciales víctimas, con una nota de su arco, de que se dispone a cazarlas —algo que el astuto y retorcido Odiseo no haría ni borracho— y justifica los siete años que se pasa con Calipso en términos de estrés postraumático por la guerra de Troya. Este último punto es un giro interesante de la personalidad del héroe que, sin embargo, desgraciadamente, acaba por ser dominante.</w:t>
-      </w:r>
-    </w:p>
-    <w:p>
-      <w:pPr>
-        <w:pStyle w:val="BodyText"/>
-      </w:pPr>
-      <w:r>
-        <w:t xml:space="preserve">Podríamos seguir con otros muchos detalles. Los lestrigones son idénticos a los modelos viejos de los cylons en</w:t>
+        <w:t xml:space="preserve">Muerte en Venecia</w:t>
+      </w:r>
+      <w:r>
+        <w:t xml:space="preserve"> </w:t>
+      </w:r>
+      <w:r>
+        <w:t xml:space="preserve">(Mann) o</w:t>
       </w:r>
       <w:r>
         <w:t xml:space="preserve"> </w:t>
@@ -685,43 +501,37 @@
           <w:i/>
           <w:iCs/>
         </w:rPr>
-        <w:t xml:space="preserve">Battlestar Galactica</w:t>
-      </w:r>
-      <w:r>
-        <w:t xml:space="preserve">. A Telémaco nos lo pinta como un boy-scout —el mismo Telémaco que ahorca a las criadas sin pestañear—. Circe, la de las largas trenzas, tiene algo de tabernera y Calipso, de traficante de drogas. Podría alegarse, sin embargo, que para gustos, los colores y también, sin mentir, que el conjunto es entretenido y bellamente filmado.</w:t>
-      </w:r>
-    </w:p>
-    <w:p>
-      <w:pPr>
-        <w:pStyle w:val="BodyText"/>
-      </w:pPr>
-      <w:r>
-        <w:t xml:space="preserve">Pero lo cierto es que una cosa es reinterpretar y otra simplificar. Nolan, supuestamente, quiere reflexionar sobre el fin de la ley de Zeus, la</w:t>
-      </w:r>
-      <w:r>
-        <w:t xml:space="preserve"> </w:t>
-      </w:r>
-      <w:r>
-        <w:rPr>
-          <w:lang w:val="el"/>
-        </w:rPr>
-        <w:t xml:space="preserve">ξενία</w:t>
-      </w:r>
-      <w:r>
-        <w:t xml:space="preserve"> </w:t>
-      </w:r>
-      <w:r>
-        <w:t xml:space="preserve">(</w:t>
+        <w:t xml:space="preserve">Los muertos</w:t>
+      </w:r>
+      <w:r>
+        <w:t xml:space="preserve"> </w:t>
+      </w:r>
+      <w:r>
+        <w:t xml:space="preserve">(Joyce) son obras maestras en el papel y en el cine. La serie televisiva sobre</w:t>
+      </w:r>
+      <w:r>
+        <w:t xml:space="preserve"> </w:t>
       </w:r>
       <w:r>
         <w:rPr>
           <w:i/>
           <w:iCs/>
         </w:rPr>
-        <w:t xml:space="preserve">xenía</w:t>
-      </w:r>
-      <w:r>
-        <w:t xml:space="preserve">), pero se salta dos ejemplos cruciales que Homero nos ofrece vívidamente. Ignora cómo Polifemo —nada menos que el hijo de un dios— se pasa la</w:t>
+        <w:t xml:space="preserve">La amiga estupenda</w:t>
+      </w:r>
+      <w:r>
+        <w:t xml:space="preserve"> </w:t>
+      </w:r>
+      <w:r>
+        <w:t xml:space="preserve">de Ferrante es tan buena como el texto escrito, entre otras cosas porque la autora participó activamente en el guion. La lista es larga y habría mucho que escribir sobre la intertextualidad del cine y la novela, sobre la miríada de formas en que se complementan y se completan.</w:t>
+      </w:r>
+    </w:p>
+    <w:p>
+      <w:pPr>
+        <w:pStyle w:val="BodyText"/>
+      </w:pPr>
+      <w:r>
+        <w:t xml:space="preserve">Entonces, ¿podemos prescindir alegremente del anticuado papel que nos obliga a descifrar signos y construir imágenes en el aire? ¿Podemos fiarle nuestra cultura, es decir, nuestra formación como ciudadanos, al cine, a las series televisivas? ¿Se pierde algo esencial por no haber leído a Tolkien? Quizás los obsesos de la lectura son</w:t>
       </w:r>
       <w:r>
         <w:t xml:space="preserve"> </w:t>
@@ -731,13 +541,13 @@
           <w:i/>
           <w:iCs/>
         </w:rPr>
-        <w:t xml:space="preserve">xenía</w:t>
-      </w:r>
-      <w:r>
-        <w:t xml:space="preserve"> </w:t>
-      </w:r>
-      <w:r>
-        <w:t xml:space="preserve">por el forro y no se molesta en hablarnos de un personaje central, Nausícaa, ni de su gente, los feacios, a pesar de que estos se caracterizan, precisamente, por respetarla a elevado coste (Poseidón luego se venga de ellos por ayudar a Odiseo). En ambos casos, la película se pega un tiro en el pie (en los dos pies, podríamos decir).</w:t>
+        <w:t xml:space="preserve">boomers</w:t>
+      </w:r>
+      <w:r>
+        <w:t xml:space="preserve"> </w:t>
+      </w:r>
+      <w:r>
+        <w:t xml:space="preserve">nostálgicos que no se enteran de que los tiempos han cambiado, como esos programadores chapados a la antigua que aún no han admitido que todo su conocimiento de C++, o de cualquier otro lenguaje de programación, es inútil en los tiempos de la IA.</w:t>
       </w:r>
     </w:p>
     <w:p>
@@ -745,7 +555,7 @@
         <w:pStyle w:val="BodyText"/>
       </w:pPr>
       <w:r>
-        <w:t xml:space="preserve">El problema es que, en los tiempos que corren, cuando el número de lectoras cada día se reduce más y el de lectores tiende a cero, uno se arriesga a que la</w:t>
+        <w:t xml:space="preserve">¡Ay!, mucho me temo que cuando el cine —o la serie televisiva— reemplaza por completo a la lectura, hay algo que se queja. Cine y literatura tienen su espacio propio, sus recursos únicos —también sus limitaciones—, y en mi opinión, forman una pareja perfecta, uno de esos matrimonios enamorados que son como un magnífico animal bicéfalo, cada parte de la pareja un individuo único, pero el total mayor que la suma de sus partes. Pero hay una asimetría. Durante tres mil años, los humanos han usado los libros para construir el mundo, mientras que el cine es un recién llegado, un chaval de poco más de un siglo. Se diría, sin embargo, que nos movemos hacia un mundo iletrado, un mundo donde no ha hecho falta quemar los libros como en</w:t>
       </w:r>
       <w:r>
         <w:t xml:space="preserve"> </w:t>
@@ -755,13 +565,57 @@
           <w:i/>
           <w:iCs/>
         </w:rPr>
-        <w:t xml:space="preserve">Odisea</w:t>
-      </w:r>
-      <w:r>
-        <w:t xml:space="preserve"> </w:t>
-      </w:r>
-      <w:r>
-        <w:t xml:space="preserve">de Nolan o la</w:t>
+        <w:t xml:space="preserve">Fahrenheit 451</w:t>
+      </w:r>
+      <w:r>
+        <w:t xml:space="preserve"> </w:t>
+      </w:r>
+      <w:r>
+        <w:t xml:space="preserve">porque nos hemos limitado a ignorarlos, un mundo donde toda la información y todo el entretenimiento van a ser audiovisuales, un mundo, de hecho, donde incluso el cine se va a ver amenazado. ¿Qué joven tiene paciencia para sentarse quieto dos o tres horas delante de una pantalla, salvo para seguir las aventuras de un adolescente en pijama (me refiero a Spider-Man, naturalmente)?</w:t>
+      </w:r>
+    </w:p>
+    <w:p>
+      <w:pPr>
+        <w:pStyle w:val="BodyText"/>
+      </w:pPr>
+      <w:r>
+        <w:t xml:space="preserve">¿Qué nos da la literatura que es difícil de captar en el cine? Quizás el ritmo interno de la prosa —Fitzgerald—, el estilo —Borges, Nabokov—, la extrañeza —Márquez, Cortázar—, la locura —Bulgakov—. La sensación de que Flaubert ha sacado un conejo de la chistera cuando, para demostrar que el marido de Emma Bovary es un pobre hombre, no habla de él, sino de su sombrero. La intuición de que la realidad es un tenue velo que esconde algo más transcendente, que alimenta la lectura de Shakespeare. El simple y puro placer de repetir en voz alta unos versos perfectos.</w:t>
+      </w:r>
+    </w:p>
+    <w:p>
+      <w:pPr>
+        <w:pStyle w:val="BlockText"/>
+      </w:pPr>
+      <w:r>
+        <w:t xml:space="preserve">Te acordaste de mí, cuando subías,</w:t>
+      </w:r>
+      <w:r>
+        <w:br/>
+      </w:r>
+      <w:r>
+        <w:t xml:space="preserve">al silencio que sufre la serpiente</w:t>
+      </w:r>
+      <w:r>
+        <w:br/>
+      </w:r>
+      <w:r>
+        <w:t xml:space="preserve">prisionera de grillos y de umbrías.</w:t>
+      </w:r>
+    </w:p>
+    <w:p>
+      <w:pPr>
+        <w:pStyle w:val="FirstParagraph"/>
+      </w:pPr>
+      <w:r>
+        <w:t xml:space="preserve">¿Cómo reducir a celuloide el infinito que despliega Lorca en tres líneas? ¿Cómo expresar la emoción con que el corazón tiembla al leer «el silencio que sufre la serpiente»?</w:t>
+      </w:r>
+    </w:p>
+    <w:p>
+      <w:pPr>
+        <w:pStyle w:val="BodyText"/>
+      </w:pPr>
+      <w:r>
+        <w:t xml:space="preserve">Hay más. Trescientas páginas —no digamos ya mil— dan de sí para crear personajes muy complejos, cuya invocación requiere espacio —que le pregunten, si no, a Proust—. Dan de sí para inventar todas esas pequeñas ramas que surgen del tronco del argumento principal y lo revisten de significado. Dan de sí para jugar con el tiempo, acelerándolo o deteniéndolo, como hace Fitzgerald en el primer capítulo de</w:t>
       </w:r>
       <w:r>
         <w:t xml:space="preserve"> </w:t>
@@ -771,21 +625,43 @@
           <w:i/>
           <w:iCs/>
         </w:rPr>
-        <w:t xml:space="preserve">Troya</w:t>
-      </w:r>
-      <w:r>
-        <w:t xml:space="preserve"> </w:t>
-      </w:r>
-      <w:r>
-        <w:t xml:space="preserve">de Petersen se conviertan en el Canon. Y eso sería grave, porque, o mucho me equivoco, o el cine le tiene miedo a Homero.</w:t>
-      </w:r>
-    </w:p>
-    <w:p>
-      <w:pPr>
-        <w:pStyle w:val="BodyText"/>
-      </w:pPr>
-      <w:r>
-        <w:t xml:space="preserve">Aun así, parafraseando a Borges, hay algo que se queda. Se queda parte de la historia, una sombra de los personajes, una evocación más o menos afortunada de un tiempo y lugar. Pero también hay algo que se queja. Y esa queja es casi inabarcable. Lo sé, porque recuerdo al niño que se enamoró de Circe, de Dido, de Nausícaa. Lo sé porque recuerdo la felicidad de leer a Homero y a Virgilio frente al vinoso Ponto, lo sé porque, afortunadamente, medio siglo después de mi primer encuentro con Homero, vuelvo a emocionarme hasta las lágrimas con la lectura de una nueva traducción de la</w:t>
+        <w:t xml:space="preserve">Gatsby</w:t>
+      </w:r>
+      <w:r>
+        <w:t xml:space="preserve">:</w:t>
+      </w:r>
+    </w:p>
+    <w:p>
+      <w:pPr>
+        <w:pStyle w:val="BlockText"/>
+      </w:pPr>
+      <w:r>
+        <w:t xml:space="preserve">We walked through a high hallway into a bright rosy-colored space, fragilely bound into the house by French windows at either end. The windows were ajar and gleaming white against the fresh grass outside that seemed to grow a little way into the house. A breeze blew through the room, blew curtains in at one end and out the other like pale flags, twisting them up toward the frosted wedding cake of the ceiling—and then rippled over the wine-colored rug, making a shadow on it as wind does on the sea.</w:t>
+      </w:r>
+    </w:p>
+    <w:p>
+      <w:pPr>
+        <w:pStyle w:val="BlockText"/>
+      </w:pPr>
+      <w:r>
+        <w:t xml:space="preserve">The only completely stationary object in the room was an enormous couch on which two young women were buoyed up as though upon an anchored balloon. They were both in white and their dresses were rippling and fluttering as if they had just been blown back in after a short flight around the house. I must have stood for a few moments listening to the whip and snap of the curtains and the groan of a picture on the wall. Then there was a boom as Tom Buchanan shut the rear windows and the caught wind died out about the room and the curtains and the rugs and the two young women ballooned slowly to the floor</w:t>
+      </w:r>
+      <w:r>
+        <w:rPr>
+          <w:rStyle w:val="FootnoteReference"/>
+        </w:rPr>
+        <w:footnoteReference w:id="9"/>
+      </w:r>
+      <w:r>
+        <w:t xml:space="preserve">.</w:t>
+      </w:r>
+    </w:p>
+    <w:p>
+      <w:pPr>
+        <w:pStyle w:val="FirstParagraph"/>
+      </w:pPr>
+      <w:r>
+        <w:t xml:space="preserve">Hay al menos dos excelentes versiones cinematográficas de</w:t>
       </w:r>
       <w:r>
         <w:t xml:space="preserve"> </w:t>
@@ -795,17 +671,1117 @@
           <w:i/>
           <w:iCs/>
         </w:rPr>
+        <w:t xml:space="preserve">Gatsby</w:t>
+      </w:r>
+      <w:r>
+        <w:t xml:space="preserve">, interpretadas por actores tan monumentales como Robert Redford (dirigido por Jack Clayton en 1974, sobre guion de Coppola) y Leonardo DiCaprio (en 2013). Ninguna de las dos consigue captar, ni de lejos, ese momento mágico, esa metáfora que asimila a Daisy y a Jordan Baker con ángeles o hadas, la misma que sugiere —solo con el acto de cerrar los ventanales— que Tom Buchanan es un personaje brutal.</w:t>
+      </w:r>
+    </w:p>
+    <w:p>
+      <w:pPr>
+        <w:pStyle w:val="BodyText"/>
+      </w:pPr>
+      <w:r>
+        <w:t xml:space="preserve">Puede argumentarse, y con razón, que el cine tiene sus propias sutilidades, su propia magia —esa combinación de teatro, música y diálogo que permite escenas sin equivalente en la página escrita—, su propia capacidad de emocionarnos y sobrecogernos, gracias a las maravillosas bandas sonoras, a las cámaras audaces, a los efectos especiales. Puede argumentarse, y con razón, que el cine se merece de sobra el calificativo de séptimo arte</w:t>
+      </w:r>
+      <w:r>
+        <w:rPr>
+          <w:rStyle w:val="FootnoteReference"/>
+        </w:rPr>
+        <w:footnoteReference w:id="10"/>
+      </w:r>
+      <w:r>
+        <w:t xml:space="preserve">.</w:t>
+      </w:r>
+    </w:p>
+    <w:p>
+      <w:pPr>
+        <w:pStyle w:val="BodyText"/>
+      </w:pPr>
+      <w:r>
+        <w:t xml:space="preserve">Pero el cine es también un negocio que mueve muchísimo dinero. Una película taquillera, como la versión de Spider-Man del verano de 2026, ha recaudado más de dos mil millones de dólares. Por comparación, los cuatro grandes detectores del Gran Colisionador de Hadrones (LHC) del CERN cuestan unos 1.500 millones de dólares; se pagaron en un periodo de diez años mediante el esfuerzo colectivo de una colaboración internacional que incluye miles de científicos y centenares de laboratorios, y están entre los aparatos más caros y sofisticados que ha producido la ciencia.</w:t>
+      </w:r>
+    </w:p>
+    <w:p>
+      <w:pPr>
+        <w:pStyle w:val="BodyText"/>
+      </w:pPr>
+      <w:r>
+        <w:t xml:space="preserve">Y una película taquillera tiene que gustarle a millones de personas, lo que implica, además de actores famosos y mucho espectáculo, un argumento que no ponga nervioso a nadie. Por ejemplo, un jovencito con poderes arácnidos, dando fabulosos saltos y combatiendo a malos suficientemente domesticados.</w:t>
+      </w:r>
+    </w:p>
+    <w:p>
+      <w:pPr>
+        <w:pStyle w:val="BodyText"/>
+      </w:pPr>
+      <w:r>
+        <w:t xml:space="preserve">¿Pero qué ocurre cuando un ambicioso director se propone narrar una de las grandes épicas de la literatura? Sabemos, por</w:t>
+      </w:r>
+      <w:r>
+        <w:t xml:space="preserve"> </w:t>
+      </w:r>
+      <w:r>
+        <w:rPr>
+          <w:i/>
+          <w:iCs/>
+        </w:rPr>
+        <w:t xml:space="preserve">El señor de los anillos</w:t>
+      </w:r>
+      <w:r>
+        <w:t xml:space="preserve">, que es posible hacerlo, pero conviene caer en la cuenta de que Tolkien, grandioso como es, no es muy complicado. Los buenos son buenísimos y carecen de fisuras; los malos comen niños fritos y son feísimos; el talante moral de Aragorn, de Arwen, de Gandalf o de Legolas, es el mismo que el del Capitán Trueno; Galadriel ofrece una pizquita de oscuridad semejante a la aceituna en el martini de bondad de los protas. Frodo y Sam protagonizan un</w:t>
+      </w:r>
+      <w:r>
+        <w:t xml:space="preserve"> </w:t>
+      </w:r>
+      <w:r>
+        <w:rPr>
+          <w:i/>
+          <w:iCs/>
+        </w:rPr>
+        <w:t xml:space="preserve">bromance</w:t>
+      </w:r>
+      <w:r>
+        <w:t xml:space="preserve"> </w:t>
+      </w:r>
+      <w:r>
+        <w:t xml:space="preserve">impecable; Boromir se hace el malo dos minutos y a continuación muere por la causa. El único personaje complejo es Gollum, que, por otra parte, acaba por redimirse y sacar a Frodo de apuros. Con toda mi admiración hacia Jackson, la trilogía de Tolkien se dejaba querer.</w:t>
+      </w:r>
+    </w:p>
+    <w:p>
+      <w:pPr>
+        <w:pStyle w:val="BodyText"/>
+      </w:pPr>
+      <w:r>
+        <w:t xml:space="preserve">¿Y la</w:t>
+      </w:r>
+      <w:r>
+        <w:t xml:space="preserve"> </w:t>
+      </w:r>
+      <w:r>
+        <w:rPr>
+          <w:i/>
+          <w:iCs/>
+        </w:rPr>
         <w:t xml:space="preserve">Odisea</w:t>
       </w:r>
       <w:r>
+        <w:t xml:space="preserve">? En este caso ha habido varios intentos con diferentes méritos y limitaciones. El</w:t>
+      </w:r>
+      <w:r>
+        <w:t xml:space="preserve"> </w:t>
+      </w:r>
+      <w:r>
+        <w:rPr>
+          <w:i/>
+          <w:iCs/>
+        </w:rPr>
+        <w:t xml:space="preserve">Ulises</w:t>
+      </w:r>
+      <w:r>
+        <w:t xml:space="preserve"> </w:t>
+      </w:r>
+      <w:r>
+        <w:t xml:space="preserve">de Camerini, en 1954, protagonizado por Kirk Douglas, tenía escenas afortunadas —incluyendo la del cíclope— y trucos muy innovadores, como usar la misma actriz para encarnar a Penélope y Circe. Recuerdo haber visto esta película en el cine de Alba, con doce o trece años y haberme pasado muchas tardes jugando a ser Ulises y Telémaco, a tensar el arco y asaetear a los pretendientes, empezando por Antínoo, que se parecía mucho al Churrero, el abusón que me traía por la calle de la amargura en el instituto. Naturalmente, era demasiado joven para entretenerme en sutiles análisis de contenido, pero agradezco de todo corazón la compañía de Kirk Douglas en mis juegos solitarios.</w:t>
+      </w:r>
+    </w:p>
+    <w:p>
+      <w:pPr>
+        <w:pStyle w:val="BodyText"/>
+      </w:pPr>
+      <w:r>
+        <w:t xml:space="preserve">En 1968, Franco Rossi se propuso rodar una versión de la</w:t>
+      </w:r>
+      <w:r>
+        <w:t xml:space="preserve"> </w:t>
+      </w:r>
+      <w:r>
+        <w:rPr>
+          <w:i/>
+          <w:iCs/>
+        </w:rPr>
+        <w:t xml:space="preserve">Odisea</w:t>
+      </w:r>
+      <w:r>
+        <w:t xml:space="preserve"> </w:t>
+      </w:r>
+      <w:r>
+        <w:t xml:space="preserve">a la altura de la épica de Homero. Empezó por escoger el formato apropiado, esto es, el de una miniserie, con un total de ocho capítulos, cada uno de una hora. Rossi entendió perfectamente que la extensión era imprescindible si se pretendía un mínimo de fidelidad a una historia densísima, en la que cada episodio, cada personaje, cada encuentro contribuyen a la construcción de la épica. A continuación, los guionistas adaptaron con bastante fidelidad el texto de Homero, incluyendo la mayoría de los episodios relevantes de la épica: las andanzas completas de Telémaco, Polifemo, sirenas, Circe, Calipso, Nausícaa, la corte de los feacios, el viaje a los infiernos y, por supuesto, la matanza de los pretendientes.</w:t>
+      </w:r>
+    </w:p>
+    <w:p>
+      <w:pPr>
+        <w:pStyle w:val="BodyText"/>
+      </w:pPr>
+      <w:r>
+        <w:t xml:space="preserve">La serie tiene sesenta años, así que puede argumentarse que viene a cuento una nueva versión, una nueva lectura del mito que aproveche los muchos recursos tecnológicos de los que disponemos, como el célebre IMAX. Claro que también sería deseable que la voluntad pedagógica que mostraron Rossi y la RAI se perpetúe, sobre todo si tenemos en cuenta los argumentos sobre los que venimos reflexionando desde hace un rato. En nuestra época iletrada, el único contacto con el mito de Odiseo que van a tener millones de personas es el que se derive de esa nueva serie o película, tal como ya sucedió, hace más de dos décadas, con</w:t>
+      </w:r>
+      <w:r>
+        <w:t xml:space="preserve"> </w:t>
+      </w:r>
+      <w:r>
+        <w:rPr>
+          <w:i/>
+          <w:iCs/>
+        </w:rPr>
+        <w:t xml:space="preserve">El señor de los anillos</w:t>
+      </w:r>
+      <w:r>
+        <w:t xml:space="preserve">.</w:t>
+      </w:r>
+    </w:p>
+    <w:p>
+      <w:pPr>
+        <w:pStyle w:val="BodyText"/>
+      </w:pPr>
+      <w:r>
+        <w:t xml:space="preserve">Así que cuando el celebrado director Christopher Nolan anunció sus planes de rodar una nueva versión de la</w:t>
+      </w:r>
+      <w:r>
+        <w:t xml:space="preserve"> </w:t>
+      </w:r>
+      <w:r>
+        <w:rPr>
+          <w:i/>
+          <w:iCs/>
+        </w:rPr>
+        <w:t xml:space="preserve">Odisea</w:t>
+      </w:r>
+      <w:r>
+        <w:t xml:space="preserve">, pensé que se trataba de buenas noticias. Con Nolan me pasa como con Joaquín Sabina. A veces me carga con su histrionismo, o me pone de mala leche con su tendencia a exhibirse. A veces me empacha tanto ego o me impaciento con sus manías. Pero no me pierdo una película suya, como nunca dejo de escuchar a Sabina. Da igual que el taimado cantautor sea a menudo un cínico con pedales, o un malote de barrio. Cuando quiere, y quiere muy a menudo, es capaz de codearse con Quevedo y con Lorca, con Cohen. Da igual que el bienfamoso director sea un místico</w:t>
+      </w:r>
+      <w:r>
+        <w:t xml:space="preserve"> </w:t>
+      </w:r>
+      <w:r>
+        <w:rPr>
+          <w:i/>
+          <w:iCs/>
+        </w:rPr>
+        <w:t xml:space="preserve">new age</w:t>
+      </w:r>
+      <w:r>
+        <w:t xml:space="preserve">. Cuando quiere, también le salen escenas como la del teseracto en</w:t>
+      </w:r>
+      <w:r>
+        <w:t xml:space="preserve"> </w:t>
+      </w:r>
+      <w:r>
+        <w:rPr>
+          <w:i/>
+          <w:iCs/>
+        </w:rPr>
+        <w:t xml:space="preserve">Interstellar</w:t>
+      </w:r>
+      <w:r>
+        <w:t xml:space="preserve">, que quitan el hipo.</w:t>
+      </w:r>
+    </w:p>
+    <w:p>
+      <w:pPr>
+        <w:pStyle w:val="BodyText"/>
+      </w:pPr>
+      <w:r>
+        <w:t xml:space="preserve">El problema, como veremos, es que Homero es mucho más difícil de manejar que Tolkien. Odiseo es un personaje casi inabarcable, contradictorio y no poco amoral. Astuto, sagaz, mentiroso, artero, cruel, implacable, odioso, valiente, elegante, generoso a veces, buen hijo y mejor padre, mal marido, gran amante, observador, sensible, capaz de hacerse atar a un mástil para escuchar a las sirenas y de arrojar a un bebé desde las murallas de Troya.</w:t>
+      </w:r>
+    </w:p>
+    <w:p>
+      <w:pPr>
+        <w:pStyle w:val="BodyText"/>
+      </w:pPr>
+      <w:r>
+        <w:t xml:space="preserve">Un personaje así presenta un problema serio al cine, sobre todo si se trata de un director</w:t>
+      </w:r>
+      <w:r>
+        <w:t xml:space="preserve"> </w:t>
+      </w:r>
+      <w:r>
+        <w:rPr>
+          <w:i/>
+          <w:iCs/>
+        </w:rPr>
+        <w:t xml:space="preserve">superstar</w:t>
+      </w:r>
+      <w:r>
+        <w:t xml:space="preserve"> </w:t>
+      </w:r>
+      <w:r>
+        <w:t xml:space="preserve">que quiere rodar una película taquillera. Pero quizás, me dije a mí mismo, sir Christopher demostraría estar a la altura de tamaño reto y nos ofrecería, si no una lectura literal —imposible en tres horas de película— al menos una interesante versión del héroe que enriqueciera el mito.</w:t>
+      </w:r>
+    </w:p>
+    <w:p>
+      <w:pPr>
+        <w:pStyle w:val="BodyText"/>
+      </w:pPr>
+      <w:r>
+        <w:t xml:space="preserve">La película se estrenó en julio de 2026, a la vez que salía a imprenta la maravillosa y atrevida traducción de la</w:t>
+      </w:r>
+      <w:r>
+        <w:t xml:space="preserve"> </w:t>
+      </w:r>
+      <w:r>
+        <w:rPr>
+          <w:i/>
+          <w:iCs/>
+        </w:rPr>
+        <w:t xml:space="preserve">Odisea</w:t>
+      </w:r>
+      <w:r>
+        <w:t xml:space="preserve"> </w:t>
+      </w:r>
+      <w:r>
+        <w:t xml:space="preserve">de Juan Manuel Tobal, publicada por Hipálage. Confieso que la lectura de esa traducción fue, literalmente, un empujón al túnel del tiempo. Me vi otra vez con quince años, leyendo por primera vez a Homero, declamando las líneas de Segalá a grito limpio, persiguiendo a mi primo Pedro con el libraco abierto que me había regalado mi padre, leyendo como quien lee la Biblia. Cuando conseguí volver al presente, me di cuenta de que Tobal había conseguido exactamente lo que se proponía al atreverse con una nueva traducción.</w:t>
+      </w:r>
+    </w:p>
+    <w:p>
+      <w:pPr>
+        <w:pStyle w:val="BodyText"/>
+      </w:pPr>
+      <w:r>
+        <w:t xml:space="preserve">¿Y qué había conseguido?</w:t>
+      </w:r>
+    </w:p>
+    <w:p>
+      <w:pPr>
+        <w:pStyle w:val="BodyText"/>
+      </w:pPr>
+      <w:r>
+        <w:t xml:space="preserve">Hacer magia.</w:t>
+      </w:r>
+    </w:p>
+    <w:p>
+      <w:pPr>
+        <w:pStyle w:val="BodyText"/>
+      </w:pPr>
+      <w:r>
+        <w:t xml:space="preserve">Unos pocos días después, fui a ver la</w:t>
+      </w:r>
+      <w:r>
+        <w:t xml:space="preserve"> </w:t>
+      </w:r>
+      <w:r>
+        <w:rPr>
+          <w:i/>
+          <w:iCs/>
+        </w:rPr>
+        <w:t xml:space="preserve">Odisea</w:t>
+      </w:r>
+      <w:r>
+        <w:t xml:space="preserve"> </w:t>
+      </w:r>
+      <w:r>
+        <w:t xml:space="preserve">de Nolan. A lo largo del último mes, la he visto tres veces. He leído las mil y una críticas que se le han dedicado. Los elogios me han parecido forzados en la mayor parte de los casos, aunque no en todos —hay escenas, como el momento en que se oye la música de las sirenas, que van a pasar a la historia del cine—. Las críticas, a menudo, también. Me he asombrado de la tinta vertida en cuestiones irrelevantes, como el color de la piel de Helena —cuando es evidente que Lupita Nyong’o es tan divinal como corresponde al personaje—, el realismo de las armaduras —¿a quién le importa?— o el hecho de que el caballo de Troya no tuviera ruedas —Homero no dice que las tenga, por cierto—. Creo, en cambio, que no se ha hablado bastante de lo que la película de Nolan dice de los hipócritas, mojigatos y, me temo, iletrados tiempos que nos ha tocado vivir.</w:t>
+      </w:r>
+    </w:p>
+    <w:p>
+      <w:pPr>
+        <w:pStyle w:val="BodyText"/>
+      </w:pPr>
+      <w:r>
+        <w:rPr>
+          <w:i/>
+          <w:iCs/>
+        </w:rPr>
+        <w:t xml:space="preserve">Leer la Odisea en tiempos iletrados</w:t>
+      </w:r>
+      <w:r>
+        <w:t xml:space="preserve"> </w:t>
+      </w:r>
+      <w:r>
+        <w:t xml:space="preserve">surgió como una reacción inmunitaria a la picadura del áspid y la del mosquito. Dejo al lector que decida cuál es cuál en las obras a las que me he referido.</w:t>
+      </w:r>
+    </w:p>
+    <w:p>
+      <w:pPr>
+        <w:pStyle w:val="BodyText"/>
+      </w:pPr>
+      <w:r>
+        <w:t xml:space="preserve">Hay otra razón más que me ha llevado a escribir este ensayo. En 2024, publiqué mi propia lectura de la</w:t>
+      </w:r>
+      <w:r>
+        <w:t xml:space="preserve"> </w:t>
+      </w:r>
+      <w:r>
+        <w:rPr>
+          <w:i/>
+          <w:iCs/>
+        </w:rPr>
+        <w:t xml:space="preserve">Odisea</w:t>
+      </w:r>
+      <w:r>
+        <w:t xml:space="preserve">, imaginando a un Ulises octogenario que repasa su vida en una Ítaca que ya no siente como suya. Es un anciano lúcido, cansado y carcomido por los remordimientos, pero a diferencia del personaje que nos dibuja Nolan, no sufre de estrés postraumático y no necesita drogas en forma de flores de loto ni psicoanalistas olímpicas. Por el contrario, es capaz de asumir el tipo de hombre que es y tomar una decisión inesperada, que lo libera de los fantasmas.</w:t>
+      </w:r>
+    </w:p>
+    <w:p>
+      <w:pPr>
+        <w:pStyle w:val="BodyText"/>
+      </w:pPr>
+      <w:r>
+        <w:t xml:space="preserve">Dichas las motivaciones, el objetivo principal de este libro es invitar (y acompañar) al lector en la lectura de Homero, a través de la espléndida traducción de Tobal. En cuanto a mi admirado sir Christopher, uso y abuso de él —bueno, de su peli— sin pudor y con no poca maldad, por lo que pido de antemano perdón a todos los olímpicos, porque no creo que Nolan sea el problema. El problema, como veremos, es que el cine actual —el cine comercial, destinado a entretener, que no a educar a las masas— teme a Homero. El problema es que el Odiseo de Homero nos pone un espejo delante en el que se refleja nuestra propia crueldad y falta de escrúpulos, y por eso el director más popular del momento lo ha convertido en un cliché santurrón, reflejando nuestra infinita hipocresía.</w:t>
+      </w:r>
+    </w:p>
+    <w:bookmarkEnd w:id="11"/>
+    <w:bookmarkStart w:id="17" w:name="el-cine-teme-a-homero"/>
+    <w:p>
+      <w:pPr>
+        <w:pStyle w:val="Heading1"/>
+      </w:pPr>
+      <w:r>
+        <w:t xml:space="preserve">El cine teme a Homero</w:t>
+      </w:r>
+    </w:p>
+    <w:p>
+      <w:pPr>
+        <w:pStyle w:val="FirstParagraph"/>
+      </w:pPr>
+      <w:r>
+        <w:t xml:space="preserve">Para mi decimoquinto cumpleaños mi padre me había prometido un «regalo que te va a gustar» y yo sospechaba que sería un libro, porque los regalos de mi padre siempre eran libros.</w:t>
+      </w:r>
+    </w:p>
+    <w:p>
+      <w:pPr>
+        <w:pStyle w:val="BodyText"/>
+      </w:pPr>
+      <w:r>
+        <w:t xml:space="preserve">En lo que se refiere a esos extraños animales, parecidos a ladrillos, con tapas de pasta y cuerpo de papel, yo era un depredador voraz y omnívoro. Devoraba todo lo que caía en mis manos y lo hacía sin contemplaciones, a toda velocidad. Mi capacidad lectora tenía un origen muy claro. Ser hijo de marino y cambiar de ciudad cada pocos años me había condenado a una soledad que mi familia numerosa no acababa de mitigar: al ser el mayor, estaba un poco por delante en edad de las dos chicas que me seguían y a años luz, en la escala de la infancia, de los otros tres chicos. Con pocos amigos y sin móviles, las opciones eran muy reducidas. Mi padre resolvió la situación cuando empezó a comprarme todos los domingos un tebeo (las aventuras del</w:t>
+      </w:r>
+      <w:r>
+        <w:t xml:space="preserve"> </w:t>
+      </w:r>
+      <w:r>
+        <w:rPr>
+          <w:i/>
+          <w:iCs/>
+        </w:rPr>
+        <w:t xml:space="preserve">Capitán Trueno</w:t>
+      </w:r>
+      <w:r>
+        <w:t xml:space="preserve">) y un libro de la maravillosa colección «Historias Selección». De ahí pasé a Emilio Salgari, Julio Verne y Mark Twain, sin despreciar las novelas de vaqueros de Marcial Lafuente Estefanía y las novelitas de ciencia ficción que escribían autores como Joe Mogar, a quienes yo suponía gringos y que resultaron ser tan españoles como yo.</w:t>
+      </w:r>
+      <w:r>
+        <w:rPr>
+          <w:rStyle w:val="FootnoteReference"/>
+        </w:rPr>
+        <w:footnoteReference w:id="12"/>
+      </w:r>
+    </w:p>
+    <w:p>
+      <w:pPr>
+        <w:pStyle w:val="BodyText"/>
+      </w:pPr>
+      <w:r>
+        <w:t xml:space="preserve">A los quince años campeaba por la biblioteca de mi padre —aquellas bibliotecas de la humilde y pluriempleada clase media española de los setenta, donde no faltaban las enciclopedias que se pagaban a plazos ni los libros, muy buenos en su mayoría, que el Círculo de Lectores enviaba cada mes— como Atila por el decadente Imperio romano. Solo que la biblioteca de mi padre no era decadente, sino la cueva del tesoro. Los veranos de mi adolescencia se comprimían, como una nave a la velocidad de la luz, en mañanas de playa y tardes tórridas que abarcaban las dos horas de siesta canónica y dos o tres de propina antes de que cediera la canícula. Leer cuatro o cinco horas al día daba para merendarse dos novelas a la semana. A veces mi primo Pedro me llevaba al cine descubierto y veíamos películas que nos interesaban bastante menos que echarnos un Marlboro —robado a mi madre— a escondidas o rondar en elipses concéntricas en torno a Toñi, que era para mí como la perla de Labuán —aunque ella ignoraba mi existencia— y la Aguja, que le había devuelto a mi primo un beso en los labios.</w:t>
+      </w:r>
+    </w:p>
+    <w:p>
+      <w:pPr>
+        <w:pStyle w:val="BodyText"/>
+      </w:pPr>
+      <w:r>
+        <w:t xml:space="preserve">El regalo llegó justo a tiempo para llevarme el enorme volumen a la playa. Me faltó tiempo para mostrárselo a Pedro y los dos pasamos un buen rato admirándolo como quien venera una Biblia, maravillándonos con aquel guerrero griego, lanza en mano, que ocupaba la portada, acariciando el lomo azul, leyendo el título con la solemnidad de quien sabe que, a partir del momento en que nos sumergiéramos en las páginas sagradas, dejaríamos de ser niños para convertirnos en adultos. Peor aún, en poetas.</w:t>
+      </w:r>
+    </w:p>
+    <w:p>
+      <w:pPr>
+        <w:pStyle w:val="BodyText"/>
+      </w:pPr>
+      <w:r>
+        <w:t xml:space="preserve">El libro era la maravillosa versión de la</w:t>
+      </w:r>
+      <w:r>
+        <w:t xml:space="preserve"> </w:t>
+      </w:r>
+      <w:r>
+        <w:rPr>
+          <w:i/>
+          <w:iCs/>
+        </w:rPr>
+        <w:t xml:space="preserve">Ilíada</w:t>
+      </w:r>
+      <w:r>
+        <w:t xml:space="preserve"> </w:t>
+      </w:r>
+      <w:r>
+        <w:t xml:space="preserve">y la</w:t>
+      </w:r>
+      <w:r>
+        <w:t xml:space="preserve"> </w:t>
+      </w:r>
+      <w:r>
+        <w:rPr>
+          <w:i/>
+          <w:iCs/>
+        </w:rPr>
+        <w:t xml:space="preserve">Odisea</w:t>
+      </w:r>
+      <w:r>
+        <w:t xml:space="preserve"> </w:t>
+      </w:r>
+      <w:r>
+        <w:t xml:space="preserve">que el Círculo publicó en 1971. La traducción —¡de 1910, nada menos!— era de Luis Segalá y Estalella, pero ese dato, entonces, se me pasó por alto. Sabía, naturalmente, que el original era un texto griego, pero estaba mucho más interesado en la leyenda del bardo ciego, el Poeta en mayúsculas, que en detalles menores como el hecho de que la versión de Segalá estuviera en prosa, mientras que Homero había escrito en hexámetros dactílicos. Algunos años más tarde leí la</w:t>
+      </w:r>
+      <w:r>
+        <w:t xml:space="preserve"> </w:t>
+      </w:r>
+      <w:r>
+        <w:rPr>
+          <w:i/>
+          <w:iCs/>
+        </w:rPr>
+        <w:t xml:space="preserve">Eneida</w:t>
+      </w:r>
+      <w:r>
+        <w:t xml:space="preserve">, a lo largo de un verano en el que tampoco faltaron playas mediterráneas. Para mi fortuna, no la leí solo ni en voz baja, sino declamando los versos libres con que Javier de Echave-Sustaeta había traducido a Virgilio. Mi acompañante, cuya memoria no han borrado cuatro décadas de ausencia, me explicó que el gran poeta latino había usado la misma métrica que Homero y que aquellos hexámetros dactílicos, ¡ay!, eran esencialmente intraducibles al castellano. Pero la versión que leíamos frente al mismo mar que habían surcado Odiseo y Eneas parecía conservar toda la poesía del original.</w:t>
+      </w:r>
+    </w:p>
+    <w:p>
+      <w:pPr>
+        <w:pStyle w:val="BlockText"/>
+      </w:pPr>
+      <w:r>
+        <w:t xml:space="preserve">Y ahora canto las armas horrendas del dios Marte</w:t>
+      </w:r>
+      <w:r>
+        <w:br/>
+      </w:r>
+      <w:r>
+        <w:t xml:space="preserve">y al héroe que forzado al destierro por el hado</w:t>
+      </w:r>
+      <w:r>
+        <w:br/>
+      </w:r>
+      <w:r>
+        <w:t xml:space="preserve">fue el primero que desde la ribera de Troya arribó a Italia.</w:t>
+      </w:r>
+    </w:p>
+    <w:p>
+      <w:pPr>
+        <w:pStyle w:val="FirstParagraph"/>
+      </w:pPr>
+      <w:r>
+        <w:t xml:space="preserve">Imagina, querida lectora, amigo lector, ese Mediterráneo del color del vino y declama, mejor aún, grita los versos. Haz que resuenen en la habitación en la que te encuentras, sal al balcón como Antonio en Alejandría y canta a las armas, a los héroes y a los interminables viajes. ¿Sientes la emoción? Bienvenida, bienvenido, al desesperado reino de la poesía.</w:t>
+      </w:r>
+    </w:p>
+    <w:p>
+      <w:pPr>
+        <w:pStyle w:val="BodyText"/>
+      </w:pPr>
+      <w:r>
+        <w:t xml:space="preserve">La versión de Segalá era en prosa y no una prosa para pusilánimes. El primer canto arrancaba así:</w:t>
+      </w:r>
+    </w:p>
+    <w:p>
+      <w:pPr>
+        <w:pStyle w:val="BlockText"/>
+      </w:pPr>
+      <w:r>
+        <w:t xml:space="preserve">Háblame, Musa, de aquel varón de multiforme ingenio que, después de destruir la sacra ciudad de Troya, anduvo peregrinando larguísimo tiempo, vio las poblaciones y conoció las costumbres de muchos hombres y padeció en su ánimo gran número de trabajos en su navegación por el ponto, en cuanto procuraba salvar su vida y la vuelta de sus compañeros a la patria. Mas ni aun así pudo librarlos, como deseaba, y todos perecieron por sus propias locuras. ¡Insensatos! Comiéronse las vacas del Sol, hijo de Hiperión; el cual no permitió que les llegara el día del regreso. ¡Oh diosa, hija de Júpiter!: cuéntanos aunque no sea más que una parte de tales cosas.</w:t>
+      </w:r>
+    </w:p>
+    <w:p>
+      <w:pPr>
+        <w:pStyle w:val="FirstParagraph"/>
+      </w:pPr>
+      <w:r>
+        <w:t xml:space="preserve">Si se lee el párrafo de un tirón, el riesgo de sofoco es grande. El texto sonaba grandilocuente y lo era, pero también emocionante y exótico. «Insensatos», le gritaba a mi primo, «comiéronse las vacas del Sol, hijo de Hiperión». Y él respondía en el mismo tono, «¡Oh diosa, hija de Júpiter!: cuéntanos aunque no sea más que una parte de tales cosas», y los dos nos sentíamos bardos y guerreros y amigos de los olímpicos.</w:t>
+      </w:r>
+    </w:p>
+    <w:p>
+      <w:pPr>
+        <w:pStyle w:val="BodyText"/>
+      </w:pPr>
+      <w:r>
+        <w:t xml:space="preserve">Por uno de aquellos caprichos de los dioses, aquel verano pasaron en el cine la película protagonizada por Kirk Douglas, que dejó de ser Kirk Douglas para siempre y se convirtió en Ulises. Pero el cinemascope no podía competir con nuestra imaginación y la mecha que la había incendiado era el texto escrito. Y una vez que la imaginación escapa, como los vientos de la bolsa de Eolo, ya no hay quien le ponga rienda. Pedro y yo nos pasamos el resto del mes de agosto navegando por el Mar Menor en el balandro diminuto que mi padre y mis tíos habían comprado para la primada. Juro que las sirenas habitaban entonces en la isla del Barón, que Nausícaa se bañaba desnuda en la Perdiguera —aunque quizás su segundo nombre era Ingrid o Helga—, que los casinos de La Manga hervían de lestrigones y que un día, creyendo a su dueño en tierra, abordamos un yate fondeado cerca del club náutico que resultó ser propiedad de un cíclope que salió de la sentina y del que escapamos milagrosamente, no sin recibir antes alguna bofetada.</w:t>
+      </w:r>
+    </w:p>
+    <w:p>
+      <w:pPr>
+        <w:pStyle w:val="BodyText"/>
+      </w:pPr>
+      <w:r>
+        <w:t xml:space="preserve">Todo hay que decirlo, la lectura de la</w:t>
+      </w:r>
+      <w:r>
+        <w:t xml:space="preserve"> </w:t>
+      </w:r>
+      <w:r>
+        <w:rPr>
+          <w:i/>
+          <w:iCs/>
+        </w:rPr>
+        <w:t xml:space="preserve">Odisea</w:t>
+      </w:r>
+      <w:r>
+        <w:t xml:space="preserve"> </w:t>
+      </w:r>
+      <w:r>
+        <w:t xml:space="preserve">me dejó varias cuentas pendientes con Ulises. Nunca le perdoné la crueldad con que masacró a los pretendientes y ejecutó a las esclavas. Tampoco tenía yo tan claro que hubiera sufrido tanto con Calipso o con Circe, de la que, por cierto, me enamoré como un cencerro. Medio siglo más tarde, zanjaría esas cuentas con el héroe (y con la bruja), imaginándolo viejo y consumido por los remordimientos en una Ítaca que ya no era su hogar, pero todavía enamorado y no precisamente de Penélope</w:t>
+      </w:r>
+      <w:r>
+        <w:rPr>
+          <w:rStyle w:val="FootnoteReference"/>
+        </w:rPr>
+        <w:footnoteReference w:id="14"/>
+      </w:r>
+      <w:r>
+        <w:t xml:space="preserve">.</w:t>
+      </w:r>
+    </w:p>
+    <w:p>
+      <w:pPr>
+        <w:pStyle w:val="BodyText"/>
+      </w:pPr>
+      <w:r>
+        <w:t xml:space="preserve">Lo que me lleva al dilema que todo marino debe resolver cuando navega por las procelosas aguas de Homero (o de Virgilio) y tiene que negociar el paso entre la Escila de la fidelidad al texto original y la Caribdis de conseguir que ese texto sea comprensible, mejor aún,</w:t>
+      </w:r>
+      <w:r>
+        <w:t xml:space="preserve"> </w:t>
+      </w:r>
+      <w:r>
+        <w:rPr>
+          <w:i/>
+          <w:iCs/>
+        </w:rPr>
+        <w:t xml:space="preserve">aceptable</w:t>
+      </w:r>
+      <w:r>
+        <w:t xml:space="preserve"> </w:t>
+      </w:r>
+      <w:r>
+        <w:t xml:space="preserve">para sus contemporáneos.</w:t>
+      </w:r>
+    </w:p>
+    <w:p>
+      <w:pPr>
+        <w:pStyle w:val="BodyText"/>
+      </w:pPr>
+      <w:r>
+        <w:t xml:space="preserve">Un ejemplo que todavía hoy me hace sufrir. En la</w:t>
+      </w:r>
+      <w:r>
+        <w:t xml:space="preserve"> </w:t>
+      </w:r>
+      <w:r>
+        <w:rPr>
+          <w:i/>
+          <w:iCs/>
+        </w:rPr>
+        <w:t xml:space="preserve">Ilíada</w:t>
+      </w:r>
+      <w:r>
+        <w:t xml:space="preserve">, que también leí aquel verano, Héctor de Troya, el más noble e insensato de todos los héroes de la literatura huye cuando Aquiles se le echa encima y ambos dan tres vueltas corriendo en torno a las murallas de Troya, antes de que se decida a plantarle cara. Cuando leí aquella escena no daba crédito a mis ojos. ¿Cómo era posible, me preguntaba, que al valeroso general, después de tomar la decisión de enfrentar al semidiós —por honor, obviamente— le entrara el canguelo y saliera por piernas? Llegué incluso a escribir una variante de la historia en la que Héctor no tenía miedo sino que intentaba agotar a Aquiles haciéndole correr, aparentemente sin darse cuenta de que se las estaba viendo con «el de los pies ligeros». Me costó bastantes años y muchas lecturas reconciliarme con el hecho de que Héctor, por noble que fuera, era humano y por tanto podía sentir miedo, como sentiría cualquiera frente a un enemigo invencible y furioso. Y cuando finalmente caí en la cuenta de la humanidad del héroe cuyo nombre lleva mi hijo, me di cuenta también de que Homero me lo había dejado claro desde el principio. El poeta se limita a describir la huida con una compasión enorme, utilizando el símil de la pesadilla, en que ni el perseguidor consigue alcanzar a su presa ni el perseguido escapar del que le acosa. Ni juzga a Aquiles por su saña, ni a Héctor por su miedo.</w:t>
+      </w:r>
+    </w:p>
+    <w:p>
+      <w:pPr>
+        <w:pStyle w:val="BodyText"/>
+      </w:pPr>
+      <w:r>
+        <w:t xml:space="preserve">¿Cómo se traslada eso a la narrativa contemporánea? Si escogemos el cine, como medio de comunicación de masas, no faltan versiones de la</w:t>
+      </w:r>
+      <w:r>
+        <w:t xml:space="preserve"> </w:t>
+      </w:r>
+      <w:r>
+        <w:rPr>
+          <w:i/>
+          <w:iCs/>
+        </w:rPr>
+        <w:t xml:space="preserve">Ilíada</w:t>
+      </w:r>
+      <w:r>
+        <w:t xml:space="preserve">. En ninguna, que yo sepa —desde luego no en la «clásica»</w:t>
+      </w:r>
+      <w:r>
+        <w:t xml:space="preserve"> </w:t>
+      </w:r>
+      <w:r>
+        <w:rPr>
+          <w:i/>
+          <w:iCs/>
+        </w:rPr>
+        <w:t xml:space="preserve">Troya</w:t>
+      </w:r>
+      <w:r>
+        <w:t xml:space="preserve"> </w:t>
+      </w:r>
+      <w:r>
+        <w:t xml:space="preserve">de Petersen (2004), en la que Eric Bana le planta cara virilmente a Brad Pitt—, aparece la escena de la huida y, en consecuencia, el personaje de Héctor se aleja del original y no para bien. El héroe de Petersen es mucho más cliché que el de Homero (de Aquiles, mejor ni hablamos) y ese cliché se transmite a millones de espectadores.</w:t>
+      </w:r>
+    </w:p>
+    <w:p>
+      <w:pPr>
+        <w:pStyle w:val="BodyText"/>
+      </w:pPr>
+      <w:r>
+        <w:t xml:space="preserve">Puede alegarse, con razón, que el cine es traducción intersemiótica y, por tanto, en última instancia, interpretación. Es decir,</w:t>
+      </w:r>
+      <w:r>
+        <w:t xml:space="preserve"> </w:t>
+      </w:r>
+      <w:r>
+        <w:rPr>
+          <w:i/>
+          <w:iCs/>
+        </w:rPr>
+        <w:t xml:space="preserve">traduttore, traditore</w:t>
+      </w:r>
+      <w:r>
+        <w:t xml:space="preserve">. Pero ni todas las traducciones son equivalentes, ni todas las traiciones igual de imperdonables.</w:t>
+      </w:r>
+    </w:p>
+    <w:p>
+      <w:pPr>
+        <w:pStyle w:val="BodyText"/>
+      </w:pPr>
+      <w:r>
+        <w:t xml:space="preserve">En una de las escenas más conseguidas de la</w:t>
+      </w:r>
+      <w:r>
+        <w:t xml:space="preserve"> </w:t>
+      </w:r>
+      <w:r>
+        <w:rPr>
+          <w:i/>
+          <w:iCs/>
+        </w:rPr>
+        <w:t xml:space="preserve">Odisea</w:t>
+      </w:r>
+      <w:r>
+        <w:t xml:space="preserve"> </w:t>
+      </w:r>
+      <w:r>
+        <w:t xml:space="preserve">de Nolan, el rapero Travis Scott interpreta a un bardo que canta la caída de Troya, acompañándose de un bastón con el que golpea rítmicamente el suelo. Hay un elemento a la vez onírico y familiar en ese híbrido entre rap e invocación épica, una conexión intensa entre el rapero negro y el bardo griego que encarna. Nolan no pretende que Travis traduzca (literalmente) a ese bardo. Pretende que lo interprete, que lo devuelva a la vida, que nos haga sentir con su rap lo que sentirían los aqueos escuchando a un poeta itinerante hace tres milenios. Y creo que, en buena medida, lo consigue.</w:t>
+      </w:r>
+    </w:p>
+    <w:p>
+      <w:pPr>
+        <w:pStyle w:val="BodyText"/>
+      </w:pPr>
+      <w:r>
+        <w:t xml:space="preserve">Interpretar la</w:t>
+      </w:r>
+      <w:r>
+        <w:t xml:space="preserve"> </w:t>
+      </w:r>
+      <w:r>
+        <w:rPr>
+          <w:i/>
+          <w:iCs/>
+        </w:rPr>
+        <w:t xml:space="preserve">Odisea</w:t>
+      </w:r>
+      <w:r>
+        <w:t xml:space="preserve"> </w:t>
+      </w:r>
+      <w:r>
+        <w:t xml:space="preserve">en clave cinematográfica requiere no poca osadía, más aún teniendo en cuenta que muchos otros cineastas lo han intentado antes. Y quizás ese sea mi mayor problema con la versión de Nolan. A pesar de su bardo rapero, a pesar de la habilidad con que quita de en medio a los dioses —excepto a una onírica Atenea—, a pesar de elipsis muy inteligentes, como la que nos permite escuchar, pero no ver, a las sirenas, o de opciones arriesgadas y elegantes como escoger a Lupita Nyong’o para interpretar a Helena —si Homero hubiera coincidido con la actriz, quizás nos habría legado «Helena la de los brazos de ébano» en lugar de «Helena la de blancos brazos»—, a la película, creo, le pasa lo mismo que a Héctor. Tiene miedo, en este caso no a Aquiles, sino al mismísimo Homero.</w:t>
+      </w:r>
+    </w:p>
+    <w:p>
+      <w:pPr>
+        <w:pStyle w:val="BodyText"/>
+      </w:pPr>
+      <w:r>
+        <w:t xml:space="preserve">Los ejemplos abundan, empezando por la misma Helena, que en la película tiene el rostro marcado por una cicatriz que le infligió el vengativo Menelao, con toda la carga de violencia machista que ello implica. Pero se da la circunstancia de que el texto de la</w:t>
+      </w:r>
+      <w:r>
+        <w:t xml:space="preserve"> </w:t>
+      </w:r>
+      <w:r>
+        <w:rPr>
+          <w:i/>
+          <w:iCs/>
+        </w:rPr>
+        <w:t xml:space="preserve">Odisea</w:t>
+      </w:r>
+      <w:r>
+        <w:t xml:space="preserve"> </w:t>
+      </w:r>
+      <w:r>
+        <w:rPr>
+          <w:i/>
+          <w:iCs/>
+        </w:rPr>
+        <w:t xml:space="preserve">contradice</w:t>
+      </w:r>
+      <w:r>
+        <w:t xml:space="preserve"> </w:t>
+      </w:r>
+      <w:r>
+        <w:t xml:space="preserve">esa lectura. En el poema, cuando Telémaco llega a Esparta encuentra a Helena radiante y a sus anchas. Otros textos clásicos, de hecho, explican que toda la furia asesina de Menelao se disuelve cuando su mujer adúltera le muestra el pecho invitándole a matarla. Lejos de hacerlo, tira la espada y la lleva de vuelta a casa.</w:t>
+      </w:r>
+    </w:p>
+    <w:p>
+      <w:pPr>
+        <w:pStyle w:val="BodyText"/>
+      </w:pPr>
+      <w:r>
+        <w:t xml:space="preserve">Ojo, no es que Homero sea feminista, pacifista o quiera evitarle al lector un mal rato. De hecho, cuando se pone, es un energúmeno.</w:t>
+      </w:r>
+      <w:r>
+        <w:t xml:space="preserve"> </w:t>
+      </w:r>
+      <w:r>
+        <w:t xml:space="preserve">En el canto XXII de la</w:t>
+      </w:r>
+      <w:r>
+        <w:t xml:space="preserve"> </w:t>
+      </w:r>
+      <w:r>
+        <w:rPr>
+          <w:i/>
+          <w:iCs/>
+        </w:rPr>
+        <w:t xml:space="preserve">Odisea</w:t>
+      </w:r>
+      <w:r>
+        <w:t xml:space="preserve">, Homero nos describe un episodio repugnante, que Nolan se salta a la torera, con la misma cintura con que Petersen se salta la huida de Héctor: acabada la matanza de los pretendientes, las doce esclavas que se habían acostado con ellos son obligadas a limpiar la sangre y luego ahorcadas por Telémaco, que demuestra con semejante salvajada que tampoco es la hermanita de la caridad que dibuja Nolan en su adaptación. Es decir, Homero no tiene problema alguno en castigar con saña a unas pobres criadas por una falta muchísimo menor que la de Helena. Leer a Homero nos dice que al poeta —y por extensión, a la gente de su tiempo— le parecía muy bien que la reina adúltera se fuera de rositas y las esclavas acabaran en la picota.</w:t>
+      </w:r>
+    </w:p>
+    <w:p>
+      <w:pPr>
+        <w:pStyle w:val="BodyText"/>
+      </w:pPr>
+      <w:r>
+        <w:t xml:space="preserve">Todavía hay más. La Helena de Homero no necesita que la castiguen. Ella misma se castiga, se maldice, se llama a sí misma</w:t>
+      </w:r>
+      <w:r>
+        <w:t xml:space="preserve"> </w:t>
+      </w:r>
+      <w:r>
+        <w:rPr>
+          <w:lang w:val="el"/>
+        </w:rPr>
+        <w:t xml:space="preserve">κυνῶπις</w:t>
+      </w:r>
+      <w:r>
+        <w:t xml:space="preserve"> </w:t>
+      </w:r>
+      <w:r>
+        <w:t xml:space="preserve">(</w:t>
+      </w:r>
+      <w:r>
+        <w:rPr>
+          <w:i/>
+          <w:iCs/>
+        </w:rPr>
+        <w:t xml:space="preserve">kynôpis</w:t>
+      </w:r>
+      <w:r>
+        <w:t xml:space="preserve">, cara de perra, desvergonzada). Helena escapa al castigo físico y a la violencia machista por ser noble y bellísima, a diferencia de las infelices esclavas. La única cicatriz que lleva es la del remordimiento. Nolan simplifica todo eso propinándole un tajo en el rostro.</w:t>
+      </w:r>
+    </w:p>
+    <w:p>
+      <w:pPr>
+        <w:pStyle w:val="BodyText"/>
+      </w:pPr>
+      <w:r>
+        <w:t xml:space="preserve">Está en su derecho, claro, y lo digo por experiencia. En mi propia versión del mito de Odiseo, reinterpreto esencialmente toda la vida y la personalidad del héroe. Reescribir al clásico no solo es necesario, es, hasta cierto punto, inevitable. Pero hay que decir que el jaleado director se complica poco la vida: el navajazo en el rostro de la bella es un cliché tan trillado como el fornido Eric Bana plantándole cara sin miedo al no menos fornido Brad Pitt. Y resulta irónico que un texto del siglo VIII a.C. ofrezca una lectura inquietante y subversiva de Helena de Troya —una belleza amoral que sobrevive a la catástrofe que causó— mientras que Nolan ofrece algo mucho más convencional y comercial a la vez, la víctima cuya cicatriz reconocemos y con la que podemos identificarnos. Exactamente igual que hace Petersen. ¿Para qué arriesgarse a que los espectadores crean que Héctor es un cobarde, si podemos suprimir la carrera?</w:t>
+      </w:r>
+    </w:p>
+    <w:p>
+      <w:pPr>
+        <w:pStyle w:val="BodyText"/>
+      </w:pPr>
+      <w:r>
+        <w:t xml:space="preserve">El segundo ejemplo es todavía más grave. En la versión de Nolan, el cíclope es un idiota casi mudo, un personaje mucho menos interesante que el gamberro y malvado Polifemo y la escena correspondiente es pura acción, sin apenas diálogo. En la</w:t>
+      </w:r>
+      <w:r>
+        <w:t xml:space="preserve"> </w:t>
+      </w:r>
+      <w:r>
+        <w:rPr>
+          <w:i/>
+          <w:iCs/>
+        </w:rPr>
+        <w:t xml:space="preserve">Odisea</w:t>
+      </w:r>
+      <w:r>
+        <w:t xml:space="preserve">, en cambio, Polifemo es</w:t>
+      </w:r>
+      <w:r>
+        <w:t xml:space="preserve"> </w:t>
+      </w:r>
+      <w:r>
+        <w:rPr>
+          <w:i/>
+          <w:iCs/>
+        </w:rPr>
+        <w:t xml:space="preserve">casi</w:t>
+      </w:r>
+      <w:r>
+        <w:t xml:space="preserve"> </w:t>
+      </w:r>
+      <w:r>
+        <w:t xml:space="preserve">tan artero como Ulises y empieza fingiendo hospitalidad:</w:t>
+      </w:r>
+    </w:p>
+    <w:p>
+      <w:pPr>
+        <w:pStyle w:val="BlockText"/>
+      </w:pPr>
+      <w:r>
+        <w:rPr>
+          <w:lang w:val="el"/>
+        </w:rPr>
+        <w:t xml:space="preserve">καί μοι τεὸν οὔνομα εἰπὲ αὐτίκα νῦν, ἵνα τοι δῶ</w:t>
+      </w:r>
+      <w:r>
+        <w:br/>
+      </w:r>
+      <w:r>
+        <w:rPr>
+          <w:lang w:val="el"/>
+        </w:rPr>
+        <w:t xml:space="preserve">ξείνιον, ᾧ κε σὺ χαίρῃς·</w:t>
+      </w:r>
+    </w:p>
+    <w:p>
+      <w:pPr>
+        <w:pStyle w:val="BlockText"/>
+      </w:pPr>
+      <w:r>
+        <w:t xml:space="preserve">Y dime tu nombre ahora mismo, para que te dé un regalo de huésped con el que te alegres.</w:t>
+      </w:r>
+      <w:r>
+        <w:rPr>
+          <w:rStyle w:val="FootnoteReference"/>
+        </w:rPr>
+        <w:footnoteReference w:id="16"/>
+      </w:r>
+    </w:p>
+    <w:p>
+      <w:pPr>
+        <w:pStyle w:val="FirstParagraph"/>
+      </w:pPr>
+      <w:r>
+        <w:t xml:space="preserve">El regalo en cuestión no es otro que zamparse a Odiseo el último. Pero Ulises tiene su propio as en la manga y contesta.</w:t>
+      </w:r>
+    </w:p>
+    <w:p>
+      <w:pPr>
+        <w:pStyle w:val="BlockText"/>
+      </w:pPr>
+      <w:r>
+        <w:rPr>
+          <w:lang w:val="el"/>
+        </w:rPr>
+        <w:t xml:space="preserve">Οὖτις ἐμοί γ’ ὄνομα· Οὖτιν δέ με κικλήσκουσι</w:t>
+      </w:r>
+      <w:r>
+        <w:br/>
+      </w:r>
+      <w:r>
+        <w:rPr>
+          <w:lang w:val="el"/>
+        </w:rPr>
+        <w:t xml:space="preserve">μήτηρ ἠδὲ πατὴρ ἠδ’ ἄλλοι πάντες ἑταῖροι.</w:t>
+      </w:r>
+    </w:p>
+    <w:p>
+      <w:pPr>
+        <w:pStyle w:val="BlockText"/>
+      </w:pPr>
+      <w:r>
+        <w:t xml:space="preserve">Nadie es mi nombre; Nadie me llaman mi madre y mi padre y todos los demás compañeros.</w:t>
+      </w:r>
+    </w:p>
+    <w:p>
+      <w:pPr>
+        <w:pStyle w:val="FirstParagraph"/>
+      </w:pPr>
+      <w:r>
+        <w:t xml:space="preserve">Así que, después de que los aqueos lo cieguen, cuando Polifemo pide ayuda a los demás cíclopes y estos le preguntan quién le ataca, contesta:</w:t>
+      </w:r>
+    </w:p>
+    <w:p>
+      <w:pPr>
+        <w:pStyle w:val="BlockText"/>
+      </w:pPr>
+      <w:r>
+        <w:rPr>
+          <w:lang w:val="el"/>
+        </w:rPr>
+        <w:t xml:space="preserve">ὦ φίλοι, Οὖτίς με κτείνει δόλῳ οὐδὲ βίηφιν.</w:t>
+      </w:r>
+    </w:p>
+    <w:p>
+      <w:pPr>
+        <w:pStyle w:val="BlockText"/>
+      </w:pPr>
+      <w:r>
+        <w:t xml:space="preserve">¡Amigos!, Nadie me mata con engaño y no con fuerza.</w:t>
+      </w:r>
+    </w:p>
+    <w:p>
+      <w:pPr>
+        <w:pStyle w:val="FirstParagraph"/>
+      </w:pPr>
+      <w:r>
+        <w:t xml:space="preserve">El problema de la lectura de Nolan, en mi opinión, es triple. Primero, transforma un personaje inteligente y cabal en un imbécil y, al hacerlo, obvia —porque nada podemos esperar de uno que no rige— el hecho de que Polifemo es un anfitrión fallido, casi podríamos decir que el arquetipo del anfitrión fallido, precisamente uno de los ejes temáticos que guían la película. Segundo, al esquivar el engaño de Ulises, pierde la oportunidad de mostrar la característica más sobresaliente del héroe —la astucia— en su momento más brillante. Tercero, vuelve a sustituir la sofisticación de Homero por un cliché. En el poema, «Nadie me mata con engaño y no con fuerza», mientras que en el film, Odiseo le dispara una flecha al Cíclope, esencialmente sustituyendo el engaño —necesario para salvarse— por la fuerza —gratuita además, ya que están a salvo—. En otras palabras, Nolan convierte a</w:t>
+      </w:r>
+      <w:r>
+        <w:t xml:space="preserve"> </w:t>
+      </w:r>
+      <w:r>
+        <w:rPr>
+          <w:lang w:val="el"/>
+        </w:rPr>
+        <w:t xml:space="preserve">πολύτροπος</w:t>
+      </w:r>
+      <w:r>
+        <w:t xml:space="preserve"> </w:t>
+      </w:r>
+      <w:r>
+        <w:t xml:space="preserve">(</w:t>
+      </w:r>
+      <w:r>
+        <w:rPr>
+          <w:i/>
+          <w:iCs/>
+        </w:rPr>
+        <w:t xml:space="preserve">politropos</w:t>
+      </w:r>
+      <w:r>
+        <w:t xml:space="preserve">), el hombre de los mil recursos, en un héroe de acción tan cliché como su Helena. De hecho, Nolan parece empeñado en dejar psicológicamente cojo a Ulises. Le hace avisar a sus potenciales víctimas, con una nota de su arco, de que se dispone a cazarlas —algo que el astuto y retorcido Odiseo no haría ni borracho— y justifica los siete años que se pasa con Calipso en términos de estrés postraumático por la guerra de Troya. Este último punto es un giro interesante de la personalidad del héroe que, sin embargo, desgraciadamente, acaba por ser dominante.</w:t>
+      </w:r>
+    </w:p>
+    <w:p>
+      <w:pPr>
+        <w:pStyle w:val="BodyText"/>
+      </w:pPr>
+      <w:r>
+        <w:t xml:space="preserve">Podríamos seguir con otros muchos detalles. Los lestrigones son idénticos a los modelos viejos de los cylons en</w:t>
+      </w:r>
+      <w:r>
+        <w:t xml:space="preserve"> </w:t>
+      </w:r>
+      <w:r>
+        <w:rPr>
+          <w:i/>
+          <w:iCs/>
+        </w:rPr>
+        <w:t xml:space="preserve">Battlestar Galactica</w:t>
+      </w:r>
+      <w:r>
+        <w:t xml:space="preserve">. A Telémaco nos lo pinta como un boy-scout —el mismo Telémaco que ahorca a las criadas sin pestañear—. Circe, la de las largas trenzas, tiene algo de tabernera y Calipso, de traficante de drogas. Podría alegarse, sin embargo, que para gustos, los colores y también, sin mentir, que el conjunto es entretenido y bellamente filmado.</w:t>
+      </w:r>
+    </w:p>
+    <w:p>
+      <w:pPr>
+        <w:pStyle w:val="BodyText"/>
+      </w:pPr>
+      <w:r>
+        <w:t xml:space="preserve">Pero lo cierto es que una cosa es reinterpretar y otra simplificar. Nolan, supuestamente, quiere reflexionar sobre el fin de la ley de Zeus, la</w:t>
+      </w:r>
+      <w:r>
+        <w:t xml:space="preserve"> </w:t>
+      </w:r>
+      <w:r>
+        <w:rPr>
+          <w:lang w:val="el"/>
+        </w:rPr>
+        <w:t xml:space="preserve">ξενία</w:t>
+      </w:r>
+      <w:r>
+        <w:t xml:space="preserve"> </w:t>
+      </w:r>
+      <w:r>
+        <w:t xml:space="preserve">(</w:t>
+      </w:r>
+      <w:r>
+        <w:rPr>
+          <w:i/>
+          <w:iCs/>
+        </w:rPr>
+        <w:t xml:space="preserve">xenía</w:t>
+      </w:r>
+      <w:r>
+        <w:t xml:space="preserve">), pero se salta dos ejemplos cruciales que Homero nos ofrece vívidamente. Ignora cómo Polifemo —nada menos que el hijo de un dios— se pasa la</w:t>
+      </w:r>
+      <w:r>
+        <w:t xml:space="preserve"> </w:t>
+      </w:r>
+      <w:r>
+        <w:rPr>
+          <w:i/>
+          <w:iCs/>
+        </w:rPr>
+        <w:t xml:space="preserve">xenía</w:t>
+      </w:r>
+      <w:r>
+        <w:t xml:space="preserve"> </w:t>
+      </w:r>
+      <w:r>
+        <w:t xml:space="preserve">por el forro y no se molesta en hablarnos de un personaje central, Nausícaa, ni de su gente, los feacios, a pesar de que estos se caracterizan, precisamente, por respetarla a elevado coste (Poseidón luego se venga de ellos por ayudar a Odiseo). En ambos casos, la película se pega un tiro en el pie (en los dos pies, podríamos decir).</w:t>
+      </w:r>
+    </w:p>
+    <w:p>
+      <w:pPr>
+        <w:pStyle w:val="BodyText"/>
+      </w:pPr>
+      <w:r>
+        <w:t xml:space="preserve">El problema es que, en los tiempos que corren, cuando el número de lectoras cada día se reduce más y el de lectores tiende a cero, uno se arriesga a que la</w:t>
+      </w:r>
+      <w:r>
+        <w:t xml:space="preserve"> </w:t>
+      </w:r>
+      <w:r>
+        <w:rPr>
+          <w:i/>
+          <w:iCs/>
+        </w:rPr>
+        <w:t xml:space="preserve">Odisea</w:t>
+      </w:r>
+      <w:r>
+        <w:t xml:space="preserve"> </w:t>
+      </w:r>
+      <w:r>
+        <w:t xml:space="preserve">de Nolan o la</w:t>
+      </w:r>
+      <w:r>
+        <w:t xml:space="preserve"> </w:t>
+      </w:r>
+      <w:r>
+        <w:rPr>
+          <w:i/>
+          <w:iCs/>
+        </w:rPr>
+        <w:t xml:space="preserve">Troya</w:t>
+      </w:r>
+      <w:r>
+        <w:t xml:space="preserve"> </w:t>
+      </w:r>
+      <w:r>
+        <w:t xml:space="preserve">de Petersen se conviertan en el Canon. Y eso sería grave, porque, o mucho me equivoco, o el cine le tiene miedo a Homero.</w:t>
+      </w:r>
+    </w:p>
+    <w:p>
+      <w:pPr>
+        <w:pStyle w:val="BodyText"/>
+      </w:pPr>
+      <w:r>
+        <w:t xml:space="preserve">Aun así, parafraseando a Borges, hay algo que se queda. Se queda parte de la historia, una sombra de los personajes, una evocación más o menos afortunada de un tiempo y lugar. Pero también hay algo que se queja. Y esa queja es casi inabarcable. Lo sé, porque recuerdo al niño que se enamoró de Circe, de Dido, de Nausícaa. Lo sé porque recuerdo la felicidad de leer a Homero y a Virgilio frente al vinoso Ponto, lo sé porque, afortunadamente, medio siglo después de mi primer encuentro con Homero, vuelvo a emocionarme hasta las lágrimas con la lectura de una nueva traducción de la</w:t>
+      </w:r>
+      <w:r>
+        <w:t xml:space="preserve"> </w:t>
+      </w:r>
+      <w:r>
+        <w:rPr>
+          <w:i/>
+          <w:iCs/>
+        </w:rPr>
+        <w:t xml:space="preserve">Odisea</w:t>
+      </w:r>
+      <w:r>
         <w:t xml:space="preserve"> </w:t>
       </w:r>
       <w:r>
         <w:t xml:space="preserve">al castellano, debida a la pluma audaz de Juan Manuel Rodríguez Tobal. Pero de eso hablaré en la segunda parte de este ensayo.</w:t>
       </w:r>
     </w:p>
-    <w:bookmarkEnd w:id="14"/>
-    <w:bookmarkStart w:id="19" w:name="una-osada-odisea"/>
+    <w:bookmarkEnd w:id="17"/>
+    <w:bookmarkStart w:id="22" w:name="una-osada-odisea"/>
     <w:p>
       <w:pPr>
         <w:pStyle w:val="Heading1"/>
@@ -1826,7 +2802,7 @@
         <w:rPr>
           <w:rStyle w:val="FootnoteReference"/>
         </w:rPr>
-        <w:footnoteReference w:id="15"/>
+        <w:footnoteReference w:id="18"/>
       </w:r>
       <w:r>
         <w:t xml:space="preserve">, Juanma Tobal tiene oído y por tanto se atreve con dos audaces sinalefas (DÉ-sehom-bre), desplaza el acento de</w:t>
@@ -2383,7 +3359,7 @@
         <w:rPr>
           <w:rStyle w:val="FootnoteReference"/>
         </w:rPr>
-        <w:footnoteReference w:id="16"/>
+        <w:footnoteReference w:id="19"/>
       </w:r>
     </w:p>
     <w:p>
@@ -3299,7 +4275,7 @@
         <w:rPr>
           <w:rStyle w:val="FootnoteReference"/>
         </w:rPr>
-        <w:footnoteReference w:id="17"/>
+        <w:footnoteReference w:id="20"/>
       </w:r>
       <w:r>
         <w:t xml:space="preserve"> </w:t>
@@ -3431,7 +4407,7 @@
         <w:rPr>
           <w:rStyle w:val="FootnoteReference"/>
         </w:rPr>
-        <w:footnoteReference w:id="18"/>
+        <w:footnoteReference w:id="21"/>
       </w:r>
     </w:p>
     <w:p>
@@ -3487,8 +4463,8 @@
         <w:t xml:space="preserve">Espero, milpoetisa lectora, fielibrado lector, haberte dejado con la miel en la boca.</w:t>
       </w:r>
     </w:p>
-    <w:bookmarkEnd w:id="19"/>
-    <w:bookmarkStart w:id="25" w:name="helena"/>
+    <w:bookmarkEnd w:id="22"/>
+    <w:bookmarkStart w:id="28" w:name="helena"/>
     <w:p>
       <w:pPr>
         <w:pStyle w:val="Heading1"/>
@@ -3804,7 +4780,7 @@
         <w:rPr>
           <w:rStyle w:val="FootnoteReference"/>
         </w:rPr>
-        <w:footnoteReference w:id="20"/>
+        <w:footnoteReference w:id="23"/>
       </w:r>
     </w:p>
     <w:p>
@@ -4054,7 +5030,7 @@
         <w:rPr>
           <w:rStyle w:val="FootnoteReference"/>
         </w:rPr>
-        <w:footnoteReference w:id="21"/>
+        <w:footnoteReference w:id="24"/>
       </w:r>
       <w:r>
         <w:t xml:space="preserve"> </w:t>
@@ -5013,7 +5989,7 @@
         <w:rPr>
           <w:rStyle w:val="FootnoteReference"/>
         </w:rPr>
-        <w:footnoteReference w:id="22"/>
+        <w:footnoteReference w:id="25"/>
       </w:r>
       <w:r>
         <w:t xml:space="preserve">, es la causante directa de la destrucción de la ciudad y todo lo que tiene que decir es: «Allí a las otras troyanas yo oía llorar; y en el fondo / yo estaba alegre, que mi corazón ya ansiaba el retorno».</w:t>
@@ -5088,7 +6064,7 @@
         <w:rPr>
           <w:rStyle w:val="FootnoteReference"/>
         </w:rPr>
-        <w:footnoteReference w:id="23"/>
+        <w:footnoteReference w:id="26"/>
       </w:r>
       <w:r>
         <w:t xml:space="preserve">.</w:t>
@@ -5471,7 +6447,7 @@
         <w:rPr>
           <w:rStyle w:val="FootnoteReference"/>
         </w:rPr>
-        <w:footnoteReference w:id="24"/>
+        <w:footnoteReference w:id="27"/>
       </w:r>
       <w:r>
         <w:t xml:space="preserve">.</w:t>
@@ -5491,8 +6467,8 @@
         <w:t xml:space="preserve">Hay una tendencia tan aburrida como nefasta en Hollywood y en buena parte de la narrativa actual a zanjarlo todo con un discurso moral que, en último término, premia a los buenos o, como mínimo, castiga a los malos. En Homero no hay moralina que valga. Hay personajes perfectamente buenos que perecen y otros rematadamente malos que se salen con la suya. Los héroes acaban en el Hades y los cuñados de los olímpicos en el Elíseo. Y la adúltera causante de la mayor catástrofe narrada por el mundo antiguo vuelve radiante a su palacio sin que nadie le toque un pelo de la divinal cabeza.</w:t>
       </w:r>
     </w:p>
-    <w:bookmarkEnd w:id="25"/>
-    <w:bookmarkStart w:id="30" w:name="calipso"/>
+    <w:bookmarkEnd w:id="28"/>
+    <w:bookmarkStart w:id="33" w:name="calipso"/>
     <w:p>
       <w:pPr>
         <w:pStyle w:val="Heading1"/>
@@ -5570,7 +6546,7 @@
         <w:rPr>
           <w:rStyle w:val="FootnoteReference"/>
         </w:rPr>
-        <w:footnoteReference w:id="26"/>
+        <w:footnoteReference w:id="29"/>
       </w:r>
       <w:r>
         <w:t xml:space="preserve">:</w:t>
@@ -5635,7 +6611,7 @@
         <w:rPr>
           <w:rStyle w:val="FootnoteReference"/>
         </w:rPr>
-        <w:footnoteReference w:id="27"/>
+        <w:footnoteReference w:id="30"/>
       </w:r>
       <w:r>
         <w:t xml:space="preserve"> </w:t>
@@ -5763,7 +6739,7 @@
         <w:rPr>
           <w:rStyle w:val="FootnoteReference"/>
         </w:rPr>
-        <w:footnoteReference w:id="28"/>
+        <w:footnoteReference w:id="31"/>
       </w:r>
       <w:r>
         <w:t xml:space="preserve"> </w:t>
@@ -7066,7 +8042,7 @@
         <w:rPr>
           <w:rStyle w:val="FootnoteReference"/>
         </w:rPr>
-        <w:footnoteReference w:id="29"/>
+        <w:footnoteReference w:id="32"/>
       </w:r>
       <w:r>
         <w:t xml:space="preserve"> </w:t>
@@ -7716,8 +8692,8 @@
         <w:t xml:space="preserve">gozan amor y delicias el uno enredado en la otra.</w:t>
       </w:r>
     </w:p>
-    <w:bookmarkEnd w:id="30"/>
-    <w:bookmarkStart w:id="32" w:name="nausícaa"/>
+    <w:bookmarkEnd w:id="33"/>
+    <w:bookmarkStart w:id="35" w:name="nausícaa"/>
     <w:p>
       <w:pPr>
         <w:pStyle w:val="Heading1"/>
@@ -9221,7 +10197,7 @@
         <w:rPr>
           <w:rStyle w:val="FootnoteReference"/>
         </w:rPr>
-        <w:footnoteReference w:id="31"/>
+        <w:footnoteReference w:id="34"/>
       </w:r>
       <w:r>
         <w:t xml:space="preserve">, me pongo en la piel de Odiseo, recordando en Ítaca aquella mañana de encuentros afortunados y aquel momento de soledad en el bosque sagrado de Atenea. A diferencia de Homero, que rara vez se demora en una introspección sostenida, mi viejo Ulises se debate entre la nostalgia y los remordimientos.</w:t>
@@ -9446,8 +10422,8 @@
         <w:t xml:space="preserve">Nausícaa es el amor imposible por partida doble. No solo la pierde el héroe atormentado y ya canoso que arriba a sus costas. La pierde también el adolescente que se quería poner en la piel de Ulises, como si un cordero pudiera suplantar a un león. Nausícaa es tan universal como Helena y Penélope, como Calipso y Circe, y lo es porque todos guardamos en nuestro corazón la imagen de esa muchacha que un día nos dedicó una sonrisa, una mirada, puede que un beso. Todos atesoramos, como un dulce y lacerante filtro, ese amor que pudo ser y no fue. Todos seguimos amando a Nausícaa.</w:t>
       </w:r>
     </w:p>
-    <w:bookmarkEnd w:id="32"/>
-    <w:bookmarkStart w:id="36" w:name="esqueria"/>
+    <w:bookmarkEnd w:id="35"/>
+    <w:bookmarkStart w:id="39" w:name="esqueria"/>
     <w:p>
       <w:pPr>
         <w:pStyle w:val="Heading1"/>
@@ -9456,7 +10432,7 @@
         <w:t xml:space="preserve">Esqueria</w:t>
       </w:r>
     </w:p>
-    <w:bookmarkStart w:id="33" w:name="el-palacio-de-alcínoo"/>
+    <w:bookmarkStart w:id="36" w:name="el-palacio-de-alcínoo"/>
     <w:p>
       <w:pPr>
         <w:pStyle w:val="Heading2"/>
@@ -10292,8 +11268,8 @@
         <w:t xml:space="preserve">con él su esposa de ley, aliñándole el lecho, se encama.</w:t>
       </w:r>
     </w:p>
-    <w:bookmarkEnd w:id="33"/>
-    <w:bookmarkStart w:id="35" w:name="bardos"/>
+    <w:bookmarkEnd w:id="36"/>
+    <w:bookmarkStart w:id="38" w:name="bardos"/>
     <w:p>
       <w:pPr>
         <w:pStyle w:val="Heading2"/>
@@ -11039,7 +12015,7 @@
         <w:rPr>
           <w:rStyle w:val="FootnoteReference"/>
         </w:rPr>
-        <w:footnoteReference w:id="34"/>
+        <w:footnoteReference w:id="37"/>
       </w:r>
       <w:r>
         <w:t xml:space="preserve">, el anciano Ulises recuerda:</w:t>
@@ -11791,9 +12767,9 @@
         <w:t xml:space="preserve">para dar un sentido a sus propios errores.</w:t>
       </w:r>
     </w:p>
-    <w:bookmarkEnd w:id="35"/>
-    <w:bookmarkEnd w:id="36"/>
-    <w:bookmarkStart w:id="40" w:name="cíclope"/>
+    <w:bookmarkEnd w:id="38"/>
+    <w:bookmarkEnd w:id="39"/>
+    <w:bookmarkStart w:id="43" w:name="cíclope"/>
     <w:p>
       <w:pPr>
         <w:pStyle w:val="Heading1"/>
@@ -12489,7 +13465,7 @@
         <w:rPr>
           <w:rStyle w:val="FootnoteReference"/>
         </w:rPr>
-        <w:footnoteReference w:id="37"/>
+        <w:footnoteReference w:id="40"/>
       </w:r>
       <w:r>
         <w:t xml:space="preserve">. Eso sí, nos avisa de que es un gigante, y nada le da pie a pensar que vaya a recibirlos amablemente, a pesar de lo cual Odiseo sigue empeñado en la visita:</w:t>
@@ -13882,7 +14858,7 @@
         <w:rPr>
           <w:rStyle w:val="FootnoteReference"/>
         </w:rPr>
-        <w:footnoteReference w:id="38"/>
+        <w:footnoteReference w:id="41"/>
       </w:r>
       <w:r>
         <w:t xml:space="preserve">. Una vez más, la precisión narrativa del Poeta es espeluznante:</w:t>
@@ -14515,7 +15491,7 @@
         <w:rPr>
           <w:rStyle w:val="FootnoteReference"/>
         </w:rPr>
-        <w:footnoteReference w:id="39"/>
+        <w:footnoteReference w:id="42"/>
       </w:r>
       <w:r>
         <w:t xml:space="preserve">, lo que me viene bien para insistir en que no me molesta en absoluto que se reinterprete o incluso se reinvente el clásico —yo mismo lo hago y hay una abundante literatura de variantes que enriquece aún más la inmortal épica—. El problema no es, en mi opinión, un cíclope estúpido, sino la falta de ambición para sacarle partido. El Polifemo de Nolan hace lo mismo que el de Homero y no aporta nada a la versión original, mucho más interesante. Pero elimina el architruco de Ulises y apunta a que este se enemista con Poseidón en un acto de justa venganza: le lanza una flecha al cíclope, provocando la ira del dios —como si haberle sacado un ojo a su chico un rato antes no fuera suficiente— por sus hombres asesinados, cuando el propio héroe cuenta, en la corte de Alcínoo, que lo hace por pura arrogancia.</w:t>
@@ -14747,8 +15723,8 @@
         <w:t xml:space="preserve">debe de estar diciendo la verdad.</w:t>
       </w:r>
     </w:p>
-    <w:bookmarkEnd w:id="40"/>
-    <w:bookmarkStart w:id="43" w:name="circe"/>
+    <w:bookmarkEnd w:id="43"/>
+    <w:bookmarkStart w:id="46" w:name="circe"/>
     <w:p>
       <w:pPr>
         <w:pStyle w:val="Heading1"/>
@@ -15696,7 +16672,7 @@
         <w:rPr>
           <w:rStyle w:val="FootnoteReference"/>
         </w:rPr>
-        <w:footnoteReference w:id="41"/>
+        <w:footnoteReference w:id="44"/>
       </w:r>
       <w:r>
         <w:t xml:space="preserve">:</w:t>
@@ -15831,7 +16807,7 @@
         <w:rPr>
           <w:rStyle w:val="FootnoteReference"/>
         </w:rPr>
-        <w:footnoteReference w:id="42"/>
+        <w:footnoteReference w:id="45"/>
       </w:r>
       <w:r>
         <w:t xml:space="preserve">. El filtro de Circe hace olvidar y evoca el de Helena, que impide sentir tristeza. Estamos ante poderosas hechiceras armadas con filtros —y varitas mágicas—. ¿Hacía falta la elaborada escena de ingeniería plástica en la que la bruja transforma a los hombres de Ulises en gorrinos, como quien dice, «a mano»? ¿No podía el bienquerido director haber dedicado todos esos minutos a darle más fondo al personaje? Otro detalle importante, que pone de manifiesto la crueldad de Circe, es que los cerdos lo son solo en apariencia, mientras que sus mentes permanecen intactas.</w:t>
@@ -17774,8 +18750,8 @@
         <w:t xml:space="preserve">pueden ser redimidos.</w:t>
       </w:r>
     </w:p>
-    <w:bookmarkEnd w:id="43"/>
-    <w:bookmarkStart w:id="48" w:name="hades"/>
+    <w:bookmarkEnd w:id="46"/>
+    <w:bookmarkStart w:id="51" w:name="hades"/>
     <w:p>
       <w:pPr>
         <w:pStyle w:val="Heading1"/>
@@ -18601,7 +19577,7 @@
         <w:rPr>
           <w:rStyle w:val="FootnoteReference"/>
         </w:rPr>
-        <w:footnoteReference w:id="44"/>
+        <w:footnoteReference w:id="47"/>
       </w:r>
       <w:r>
         <w:t xml:space="preserve">.</w:t>
@@ -18875,7 +19851,7 @@
         <w:rPr>
           <w:rStyle w:val="FootnoteReference"/>
         </w:rPr>
-        <w:footnoteReference w:id="45"/>
+        <w:footnoteReference w:id="48"/>
       </w:r>
       <w:r>
         <w:t xml:space="preserve">. Ulises todavía está conversando con Agamenón cuando las sombras de los guerreros se acercan:</w:t>
@@ -19106,7 +20082,7 @@
         <w:rPr>
           <w:rStyle w:val="FootnoteReference"/>
         </w:rPr>
-        <w:footnoteReference w:id="46"/>
+        <w:footnoteReference w:id="49"/>
       </w:r>
       <w:r>
         <w:t xml:space="preserve">:</w:t>
@@ -19426,7 +20402,7 @@
         <w:rPr>
           <w:rStyle w:val="FootnoteReference"/>
         </w:rPr>
-        <w:footnoteReference w:id="47"/>
+        <w:footnoteReference w:id="50"/>
       </w:r>
       <w:r>
         <w:t xml:space="preserve">:</w:t>
@@ -19594,8 +20570,8 @@
         <w:t xml:space="preserve">En nuestro propio tiempo, obsesionados como estamos con la vida eterna que se nos sigue negando igual que a los griegos y con la eterna juventud que ni el bótox ni la cirugía plástica pueden comprar ni siquiera a los más pudientes, la idea de que la muerte pueda ser redención se nos hace extraña y casi repugnante. La culpa es de los dos mil años que llevamos oyendo hablar del Paraíso y la resurrección. No es que nadie se tome muy en serio esas leyendas hoy en día, pero sí nos han hecho olvidar que para los helenos, la vida después de la muerte no era vida, sino una parodia grotesca, un horrible existir sin existir. De ahí que Demócrito declare que la muerte son buenas noticias, de ahí que Epicuro nos diga que no hay que temerla ni preocuparse por ella ya que nos liberará, para siempre, del Hades.</w:t>
       </w:r>
     </w:p>
-    <w:bookmarkEnd w:id="48"/>
-    <w:bookmarkStart w:id="52" w:name="agamenón-y-clitemnestra"/>
+    <w:bookmarkEnd w:id="51"/>
+    <w:bookmarkStart w:id="55" w:name="agamenón-y-clitemnestra"/>
     <w:p>
       <w:pPr>
         <w:pStyle w:val="Heading1"/>
@@ -20241,7 +21217,7 @@
         <w:rPr>
           <w:rStyle w:val="FootnoteReference"/>
         </w:rPr>
-        <w:footnoteReference w:id="49"/>
+        <w:footnoteReference w:id="52"/>
       </w:r>
       <w:r>
         <w:t xml:space="preserve">. Hay, además, un estupendo giro en el film. Lupita Nyong’o interpreta tanto a Helena como a Clitemnestra, algo bastante convincente, ya que las dos reinas son medias hermanas. El espectador se queda, la verdad sea dicha, razonablemente satisfecho con el matarile de Agamenón, y eso que Nolan se salta detalles que en Eurípides ponen los pelos de punta. De hecho, en mi</w:t>
@@ -20260,7 +21236,7 @@
         <w:rPr>
           <w:rStyle w:val="FootnoteReference"/>
         </w:rPr>
-        <w:footnoteReference w:id="50"/>
+        <w:footnoteReference w:id="53"/>
       </w:r>
       <w:r>
         <w:t xml:space="preserve">, también prefiero la versión de Nolan a la de la</w:t>
@@ -20279,7 +21255,7 @@
         <w:rPr>
           <w:rStyle w:val="FootnoteReference"/>
         </w:rPr>
-        <w:footnoteReference w:id="51"/>
+        <w:footnoteReference w:id="54"/>
       </w:r>
       <w:r>
         <w:t xml:space="preserve">. Una versión en la que, por cierto, el amigo Odiseo no sale muy bien parado. Los remordimientos por esos pecados le consumen en Ítaca.</w:t>
@@ -20635,8 +21611,8 @@
         <w:t xml:space="preserve">No, el sacrificio de un inocente no admite justificación alguna. A estas alturas, tres mil años después de Homero, deberíamos haber aprendido una lección tan simple que, desafortunadamente —basta seguir las noticias durante cinco minutos— se nos sigue escapando.</w:t>
       </w:r>
     </w:p>
-    <w:bookmarkEnd w:id="52"/>
-    <w:bookmarkStart w:id="54" w:name="sirenas"/>
+    <w:bookmarkEnd w:id="55"/>
+    <w:bookmarkStart w:id="57" w:name="sirenas"/>
     <w:p>
       <w:pPr>
         <w:pStyle w:val="Heading1"/>
@@ -21475,7 +22451,7 @@
         <w:rPr>
           <w:rStyle w:val="FootnoteReference"/>
         </w:rPr>
-        <w:footnoteReference w:id="53"/>
+        <w:footnoteReference w:id="56"/>
       </w:r>
       <w:r>
         <w:t xml:space="preserve">, escribo mi propia versión. Homero no da muchos detalles de cómo se sentían los protagonistas de su historia. Los muestra a menudo comiendo o bebiendo —generalmente en exceso—, discutiendo, llorando, vociferando, o intentando salvar el pellejo. Pero rara vez sentimos sus emociones, rara vez llegamos a ponernos en su piel. Y sin embargo, son hombres como nosotros:</w:t>
@@ -21783,8 +22759,8 @@
         <w:t xml:space="preserve">huyendo.</w:t>
       </w:r>
     </w:p>
-    <w:bookmarkEnd w:id="54"/>
-    <w:bookmarkStart w:id="55" w:name="la-matanza-de-los-pretendientes"/>
+    <w:bookmarkEnd w:id="57"/>
+    <w:bookmarkStart w:id="58" w:name="la-matanza-de-los-pretendientes"/>
     <w:p>
       <w:pPr>
         <w:pStyle w:val="Heading1"/>
@@ -25121,8 +26097,8 @@
         <w:t xml:space="preserve">Parece que la masacre ha terminado, ¿no? Pues aún falta lo peor. Pero de eso nos ocuparemos en el siguiente capítulo.</w:t>
       </w:r>
     </w:p>
-    <w:bookmarkEnd w:id="55"/>
-    <w:bookmarkStart w:id="56" w:name="el-asesinato-de-las-niñas"/>
+    <w:bookmarkEnd w:id="58"/>
+    <w:bookmarkStart w:id="59" w:name="el-asesinato-de-las-niñas"/>
     <w:p>
       <w:pPr>
         <w:pStyle w:val="Heading1"/>
@@ -26206,8 +27182,8 @@
         <w:t xml:space="preserve">No es de extrañar que el cine tema a Homero.</w:t>
       </w:r>
     </w:p>
-    <w:bookmarkEnd w:id="56"/>
-    <w:bookmarkStart w:id="57" w:name="penélope"/>
+    <w:bookmarkEnd w:id="59"/>
+    <w:bookmarkStart w:id="60" w:name="penélope"/>
     <w:p>
       <w:pPr>
         <w:pStyle w:val="Heading1"/>
@@ -27542,8 +28518,8 @@
         <w:t xml:space="preserve">Podemos dejar aquí, en un final feliz un poco falso, nuestra historia. No todos los cabos han quedado atados, sin embargo. Ulises le hará a su esposa el relato de sus aventuras y ella tendrá que fingir que no le importan el año con Circe ni los siete años con Calipso. O quizás más difícil, tendrá que aprender a convivir con un extraño.</w:t>
       </w:r>
     </w:p>
-    <w:bookmarkEnd w:id="57"/>
-    <w:bookmarkStart w:id="61" w:name="homero"/>
+    <w:bookmarkEnd w:id="60"/>
+    <w:bookmarkStart w:id="64" w:name="homero"/>
     <w:p>
       <w:pPr>
         <w:pStyle w:val="Heading1"/>
@@ -28460,7 +29436,7 @@
         <w:rPr>
           <w:rStyle w:val="FootnoteReference"/>
         </w:rPr>
-        <w:footnoteReference w:id="58"/>
+        <w:footnoteReference w:id="61"/>
       </w:r>
       <w:r>
         <w:t xml:space="preserve">.</w:t>
@@ -28485,7 +29461,7 @@
         <w:rPr>
           <w:rStyle w:val="FootnoteReference"/>
         </w:rPr>
-        <w:footnoteReference w:id="60"/>
+        <w:footnoteReference w:id="63"/>
       </w:r>
       <w:r>
         <w:t xml:space="preserve">. Unos y otros improvisan, sí, pero basándose en patrones bien establecidos y memorizados que les permiten ejecutar en tiempo real variaciones sobre un tema y les facilitan el ritmo y la rima. Es algo parecido a lo que se hace en jazz, donde la inagotable creatividad de los músicos se ancla en un tronco musical muy robusto.</w:t>
@@ -28736,7 +29712,7 @@
         <w:t xml:space="preserve">.</w:t>
       </w:r>
     </w:p>
-    <w:bookmarkEnd w:id="61"/>
+    <w:bookmarkEnd w:id="64"/>
     <w:sectPr>
       <w:footnotePr>
         <w:numRestart w:val="eachSect"/>
@@ -28780,7 +29756,77 @@
       <w:r>
         <w:t xml:space="preserve"> </w:t>
       </w:r>
-      <w:hyperlink r:id="rId10">
+      <w:r>
+        <w:t xml:space="preserve">He preferido copiar el original, cuya belleza es apabullante. Añado aquí una traducción al español:</w:t>
+      </w:r>
+      <w:r>
+        <w:t xml:space="preserve"> </w:t>
+      </w:r>
+      <w:r>
+        <w:rPr>
+          <w:i/>
+          <w:iCs/>
+        </w:rPr>
+        <w:t xml:space="preserve">Pasando por un corredor de techo alto llegamos a un alegre espacio de colores vivos, apenas integrado a la casa por ventanales franceses a lado y lado. Los ventanales blancos estaban abiertos del todo y resplandecían contra el césped verde de la parte de afuera, que parecía entrar un poco en la casa. La brisa soplaba a través del cuarto, haciendo elevarse hacia adentro la cortina de un lado y hacia afuera la del otro, como pálidas banderas, enroscándolas y lanzándolas hacia la escarchada</w:t>
+      </w:r>
+      <w:r>
+        <w:rPr>
+          <w:i/>
+          <w:iCs/>
+        </w:rPr>
+        <w:t xml:space="preserve"> </w:t>
+      </w:r>
+      <w:r>
+        <w:rPr>
+          <w:i/>
+          <w:iCs/>
+        </w:rPr>
+        <w:t xml:space="preserve">cubierta de bizcocho de novia que era el techo, para después hacer rizos sobre el tapiz de color vino tinto, formando una sombra sobre él, como el viento al soplar sobre el mar.</w:t>
+      </w:r>
+    </w:p>
+    <w:p>
+      <w:pPr>
+        <w:pStyle w:val="FootnoteText"/>
+      </w:pPr>
+      <w:r>
+        <w:t xml:space="preserve">El único objeto completamente estacionario en el cuarto era un enorme sofá en el que había dos mujeres flotando como sobre un globo anclado. Ambas vestían de blanco, y sus trajes revoloteaban ondulados como si hubieran acabado de regresar por el aire tras un corto vuelo por los alrededores de la casa. Debí haber permanecido unos instantes escuchando el restañar y revolotear de las cortinas y el crujir del retrato de la pared. Entonces se escuchó una explosión cuando Tom Buchanan cerró el ventanal de atrás y el viento atrapado murió en el cuarto, y las cortinas y los tapetes y las dos mujeres descendieron cual globos con lentitud hasta el piso.</w:t>
+      </w:r>
+    </w:p>
+  </w:footnote>
+  <w:footnote w:id="10">
+    <w:p>
+      <w:pPr>
+        <w:pStyle w:val="FootnoteText"/>
+      </w:pPr>
+      <w:r>
+        <w:rPr>
+          <w:rStyle w:val="FootnoteReference"/>
+        </w:rPr>
+        <w:footnoteRef/>
+      </w:r>
+      <w:r>
+        <w:t xml:space="preserve"> </w:t>
+      </w:r>
+      <w:r>
+        <w:t xml:space="preserve">De hecho, mi adicción al cine es casi tan temprana como mi vicio por la lectura. A los diez años, mi familia se mudó a un pueblo de la costa mediterránea, situado entre Vinaroz y Amposta, al que siempre me he referido como Alba, quizás porque, como Cervantes, prefiero no acordarme de su nombre. Mi padre era la autoridad militar de la plaza, lo que nos daba a sus hijos la identidad de extraterrestres y a mí me granjeó durante mucho tiempo el estatus de paria. Durante la semana, me veía a menudo con Quelo, mi único amigo, pero los domingos Quelo tenía otros planes, con sus amigos de siempre. Yo solo tenía la sesión doble en el cine del pueblo y una bolsa de pipas, para olvidar la soledad.</w:t>
+      </w:r>
+    </w:p>
+  </w:footnote>
+  <w:footnote w:id="12">
+    <w:p>
+      <w:pPr>
+        <w:pStyle w:val="FootnoteText"/>
+      </w:pPr>
+      <w:r>
+        <w:rPr>
+          <w:rStyle w:val="FootnoteReference"/>
+        </w:rPr>
+        <w:footnoteRef/>
+      </w:r>
+      <w:r>
+        <w:t xml:space="preserve"> </w:t>
+      </w:r>
+      <w:hyperlink r:id="rId13">
         <w:r>
           <w:rPr>
             <w:rStyle w:val="Hyperlink"/>
@@ -28790,7 +29836,7 @@
       </w:hyperlink>
     </w:p>
   </w:footnote>
-  <w:footnote w:id="11">
+  <w:footnote w:id="14">
     <w:p>
       <w:pPr>
         <w:pStyle w:val="FootnoteText"/>
@@ -28804,7 +29850,7 @@
       <w:r>
         <w:t xml:space="preserve"> </w:t>
       </w:r>
-      <w:hyperlink r:id="rId12">
+      <w:hyperlink r:id="rId15">
         <w:r>
           <w:rPr>
             <w:rStyle w:val="Hyperlink"/>
@@ -28814,7 +29860,7 @@
       </w:hyperlink>
     </w:p>
   </w:footnote>
-  <w:footnote w:id="13">
+  <w:footnote w:id="16">
     <w:p>
       <w:pPr>
         <w:pStyle w:val="FootnoteText"/>
@@ -28858,7 +29904,7 @@
       </w:r>
     </w:p>
   </w:footnote>
-  <w:footnote w:id="15">
+  <w:footnote w:id="18">
     <w:p>
       <w:pPr>
         <w:pStyle w:val="FootnoteText"/>
@@ -28894,7 +29940,7 @@
       <w:r>
         <w:t xml:space="preserve"> </w:t>
       </w:r>
-      <w:hyperlink r:id="rId12">
+      <w:hyperlink r:id="rId15">
         <w:r>
           <w:rPr>
             <w:rStyle w:val="Hyperlink"/>
@@ -28907,7 +29953,7 @@
       </w:r>
     </w:p>
   </w:footnote>
-  <w:footnote w:id="16">
+  <w:footnote w:id="19">
     <w:p>
       <w:pPr>
         <w:pStyle w:val="FootnoteText"/>
@@ -28935,164 +29981,6 @@
       </w:r>
       <w:r>
         <w:t xml:space="preserve">, «de cinco mitades»: si cada pie se divide en dos medios pies, la pentemímeris es la pausa que cae tras el quinto medio pie, es decir, justo después del tercer apoyo. Es el respiro más frecuente del hexámetro homérico, y no lo marca el metro sino la frase: un final de palabra que parte el verso en dos hemistiquios desiguales.</w:t>
-      </w:r>
-    </w:p>
-  </w:footnote>
-  <w:footnote w:id="17">
-    <w:p>
-      <w:pPr>
-        <w:pStyle w:val="FootnoteText"/>
-      </w:pPr>
-      <w:r>
-        <w:rPr>
-          <w:rStyle w:val="FootnoteReference"/>
-        </w:rPr>
-        <w:footnoteRef/>
-      </w:r>
-      <w:r>
-        <w:t xml:space="preserve"> </w:t>
-      </w:r>
-      <w:r>
-        <w:t xml:space="preserve">Habrán notado la observafiel lectora, el veolotodo lector, que me permito la libertad de llamar a Juan Manuel por su nombre, echando mano de la cercanía de la amistad y reservando el «don» para sus clásicos —y difuntos— predecesores.</w:t>
-      </w:r>
-    </w:p>
-  </w:footnote>
-  <w:footnote w:id="18">
-    <w:p>
-      <w:pPr>
-        <w:pStyle w:val="FootnoteText"/>
-      </w:pPr>
-      <w:r>
-        <w:rPr>
-          <w:rStyle w:val="FootnoteReference"/>
-        </w:rPr>
-        <w:footnoteRef/>
-      </w:r>
-      <w:r>
-        <w:t xml:space="preserve"> </w:t>
-      </w:r>
-      <w:r>
-        <w:t xml:space="preserve">Quien imagine a un poeta como animal solemne, embelesado en la contemplación del Parnaso, es que ha leído demasiada literatura francesa. La poesía es pasión, sí, pero también, y mucho, juego y risa. A cuenta de unas correcciones finales que Juanma ofrecía al texto, me arrancaba yo con unos ripios endecasílabos:</w:t>
-      </w:r>
-    </w:p>
-    <w:p>
-      <w:pPr>
-        <w:pStyle w:val="FootnoteBlockText"/>
-      </w:pPr>
-      <w:r>
-        <w:t xml:space="preserve">Solo una coma, sí, eliminaría,</w:t>
-      </w:r>
-      <w:r>
-        <w:br/>
-      </w:r>
-      <w:r>
-        <w:t xml:space="preserve">me opongo a que preceda a «milerrante»,</w:t>
-      </w:r>
-      <w:r>
-        <w:br/>
-      </w:r>
-      <w:r>
-        <w:t xml:space="preserve">porque por ella el dativo ambulante,</w:t>
-      </w:r>
-      <w:r>
-        <w:br/>
-      </w:r>
-      <w:r>
-        <w:t xml:space="preserve">sin duda a las Musas invitaría.</w:t>
-      </w:r>
-    </w:p>
-    <w:p>
-      <w:pPr>
-        <w:pStyle w:val="FootnoteBlockText"/>
-      </w:pPr>
-      <w:r>
-        <w:t xml:space="preserve">Cuidemos la perífrasis, cabales,</w:t>
-      </w:r>
-      <w:r>
-        <w:br/>
-      </w:r>
-      <w:r>
-        <w:t xml:space="preserve">y quita coma después de «extravío»,</w:t>
-      </w:r>
-      <w:r>
-        <w:br/>
-      </w:r>
-      <w:r>
-        <w:t xml:space="preserve">y antes de zarpar del puerto el navío,</w:t>
-      </w:r>
-      <w:r>
-        <w:br/>
-      </w:r>
-      <w:r>
-        <w:t xml:space="preserve">arregla mayúsculas iniciales.</w:t>
-      </w:r>
-    </w:p>
-    <w:p>
-      <w:pPr>
-        <w:pStyle w:val="FootnoteBlockText"/>
-      </w:pPr>
-      <w:r>
-        <w:t xml:space="preserve">Ya nada más objeto, compañero,</w:t>
-      </w:r>
-      <w:r>
-        <w:br/>
-      </w:r>
-      <w:r>
-        <w:t xml:space="preserve">Vayacondios, por el ponto mi Ulises,</w:t>
-      </w:r>
-      <w:r>
-        <w:br/>
-      </w:r>
-      <w:r>
-        <w:t xml:space="preserve">que es vagabundo, mañoso y artero,</w:t>
-      </w:r>
-    </w:p>
-    <w:p>
-      <w:pPr>
-        <w:pStyle w:val="FootnoteBlockText"/>
-      </w:pPr>
-      <w:r>
-        <w:t xml:space="preserve">Que es de todos los hombres el primero</w:t>
-      </w:r>
-      <w:r>
-        <w:br/>
-      </w:r>
-      <w:r>
-        <w:t xml:space="preserve">y el último también, hombre de ardides,</w:t>
-      </w:r>
-      <w:r>
-        <w:br/>
-      </w:r>
-      <w:r>
-        <w:t xml:space="preserve">como todo hombre, falso y verdadero.</w:t>
-      </w:r>
-    </w:p>
-    <w:p>
-      <w:pPr>
-        <w:pStyle w:val="FootnoteText"/>
-      </w:pPr>
-      <w:r>
-        <w:t xml:space="preserve">A las que él respondía con la autoridad del patrón al marinero:</w:t>
-      </w:r>
-    </w:p>
-    <w:p>
-      <w:pPr>
-        <w:pStyle w:val="FootnoteBlockText"/>
-      </w:pPr>
-      <w:r>
-        <w:t xml:space="preserve">Harto vivo el poema te ha salido</w:t>
-      </w:r>
-      <w:r>
-        <w:br/>
-      </w:r>
-      <w:r>
-        <w:t xml:space="preserve">aunque de «milerrante», buen amigo, en otra afino</w:t>
-      </w:r>
-      <w:r>
-        <w:br/>
-      </w:r>
-      <w:r>
-        <w:t xml:space="preserve">que es que es acusativo, no dativo</w:t>
       </w:r>
     </w:p>
   </w:footnote>
@@ -29111,7 +29999,7 @@
         <w:t xml:space="preserve"> </w:t>
       </w:r>
       <w:r>
-        <w:t xml:space="preserve">El poema se llama «Deslealtad» y cito la magnífica traducción de José María Álvarez en Hiperión, 1976.</w:t>
+        <w:t xml:space="preserve">Habrán notado la observafiel lectora, el veolotodo lector, que me permito la libertad de llamar a Juan Manuel por su nombre, echando mano de la cercanía de la amistad y reservando el «don» para sus clásicos —y difuntos— predecesores.</w:t>
       </w:r>
     </w:p>
   </w:footnote>
@@ -29130,11 +30018,169 @@
         <w:t xml:space="preserve"> </w:t>
       </w:r>
       <w:r>
+        <w:t xml:space="preserve">Quien imagine a un poeta como animal solemne, embelesado en la contemplación del Parnaso, es que ha leído demasiada literatura francesa. La poesía es pasión, sí, pero también, y mucho, juego y risa. A cuenta de unas correcciones finales que Juanma ofrecía al texto, me arrancaba yo con unos ripios endecasílabos:</w:t>
+      </w:r>
+    </w:p>
+    <w:p>
+      <w:pPr>
+        <w:pStyle w:val="FootnoteBlockText"/>
+      </w:pPr>
+      <w:r>
+        <w:t xml:space="preserve">Solo una coma, sí, eliminaría,</w:t>
+      </w:r>
+      <w:r>
+        <w:br/>
+      </w:r>
+      <w:r>
+        <w:t xml:space="preserve">me opongo a que preceda a «milerrante»,</w:t>
+      </w:r>
+      <w:r>
+        <w:br/>
+      </w:r>
+      <w:r>
+        <w:t xml:space="preserve">porque por ella el dativo ambulante,</w:t>
+      </w:r>
+      <w:r>
+        <w:br/>
+      </w:r>
+      <w:r>
+        <w:t xml:space="preserve">sin duda a las Musas invitaría.</w:t>
+      </w:r>
+    </w:p>
+    <w:p>
+      <w:pPr>
+        <w:pStyle w:val="FootnoteBlockText"/>
+      </w:pPr>
+      <w:r>
+        <w:t xml:space="preserve">Cuidemos la perífrasis, cabales,</w:t>
+      </w:r>
+      <w:r>
+        <w:br/>
+      </w:r>
+      <w:r>
+        <w:t xml:space="preserve">y quita coma después de «extravío»,</w:t>
+      </w:r>
+      <w:r>
+        <w:br/>
+      </w:r>
+      <w:r>
+        <w:t xml:space="preserve">y antes de zarpar del puerto el navío,</w:t>
+      </w:r>
+      <w:r>
+        <w:br/>
+      </w:r>
+      <w:r>
+        <w:t xml:space="preserve">arregla mayúsculas iniciales.</w:t>
+      </w:r>
+    </w:p>
+    <w:p>
+      <w:pPr>
+        <w:pStyle w:val="FootnoteBlockText"/>
+      </w:pPr>
+      <w:r>
+        <w:t xml:space="preserve">Ya nada más objeto, compañero,</w:t>
+      </w:r>
+      <w:r>
+        <w:br/>
+      </w:r>
+      <w:r>
+        <w:t xml:space="preserve">Vayacondios, por el ponto mi Ulises,</w:t>
+      </w:r>
+      <w:r>
+        <w:br/>
+      </w:r>
+      <w:r>
+        <w:t xml:space="preserve">que es vagabundo, mañoso y artero,</w:t>
+      </w:r>
+    </w:p>
+    <w:p>
+      <w:pPr>
+        <w:pStyle w:val="FootnoteBlockText"/>
+      </w:pPr>
+      <w:r>
+        <w:t xml:space="preserve">Que es de todos los hombres el primero</w:t>
+      </w:r>
+      <w:r>
+        <w:br/>
+      </w:r>
+      <w:r>
+        <w:t xml:space="preserve">y el último también, hombre de ardides,</w:t>
+      </w:r>
+      <w:r>
+        <w:br/>
+      </w:r>
+      <w:r>
+        <w:t xml:space="preserve">como todo hombre, falso y verdadero.</w:t>
+      </w:r>
+    </w:p>
+    <w:p>
+      <w:pPr>
+        <w:pStyle w:val="FootnoteText"/>
+      </w:pPr>
+      <w:r>
+        <w:t xml:space="preserve">A las que él respondía con la autoridad del patrón al marinero:</w:t>
+      </w:r>
+    </w:p>
+    <w:p>
+      <w:pPr>
+        <w:pStyle w:val="FootnoteBlockText"/>
+      </w:pPr>
+      <w:r>
+        <w:t xml:space="preserve">Harto vivo el poema te ha salido</w:t>
+      </w:r>
+      <w:r>
+        <w:br/>
+      </w:r>
+      <w:r>
+        <w:t xml:space="preserve">aunque de «milerrante», buen amigo, en otra afino</w:t>
+      </w:r>
+      <w:r>
+        <w:br/>
+      </w:r>
+      <w:r>
+        <w:t xml:space="preserve">que es que es acusativo, no dativo</w:t>
+      </w:r>
+    </w:p>
+  </w:footnote>
+  <w:footnote w:id="23">
+    <w:p>
+      <w:pPr>
+        <w:pStyle w:val="FootnoteText"/>
+      </w:pPr>
+      <w:r>
+        <w:rPr>
+          <w:rStyle w:val="FootnoteReference"/>
+        </w:rPr>
+        <w:footnoteRef/>
+      </w:r>
+      <w:r>
+        <w:t xml:space="preserve"> </w:t>
+      </w:r>
+      <w:r>
+        <w:t xml:space="preserve">El poema se llama «Deslealtad» y cito la magnífica traducción de José María Álvarez en Hiperión, 1976.</w:t>
+      </w:r>
+    </w:p>
+  </w:footnote>
+  <w:footnote w:id="24">
+    <w:p>
+      <w:pPr>
+        <w:pStyle w:val="FootnoteText"/>
+      </w:pPr>
+      <w:r>
+        <w:rPr>
+          <w:rStyle w:val="FootnoteReference"/>
+        </w:rPr>
+        <w:footnoteRef/>
+      </w:r>
+      <w:r>
+        <w:t xml:space="preserve"> </w:t>
+      </w:r>
+      <w:r>
         <w:t xml:space="preserve">Debida a Estesícoro de Hímera (c. 630-555 a.C.).</w:t>
       </w:r>
     </w:p>
   </w:footnote>
-  <w:footnote w:id="22">
+  <w:footnote w:id="25">
     <w:p>
       <w:pPr>
         <w:pStyle w:val="FootnoteText"/>
@@ -29333,7 +30379,7 @@
       </w:r>
     </w:p>
   </w:footnote>
-  <w:footnote w:id="23">
+  <w:footnote w:id="26">
     <w:p>
       <w:pPr>
         <w:pStyle w:val="FootnoteText"/>
@@ -29381,7 +30427,7 @@
       </w:r>
     </w:p>
   </w:footnote>
-  <w:footnote w:id="24">
+  <w:footnote w:id="27">
     <w:p>
       <w:pPr>
         <w:pStyle w:val="FootnoteText"/>
@@ -29397,63 +30443,6 @@
       </w:r>
       <w:r>
         <w:t xml:space="preserve">El Hades poco tiene que envidiarle al infierno de Dante, pero no está poblado por las almas de los réprobos, sino que allí va a parar todo el mundo: buenos, malos, valientes, cobardes, sabios y obtusos. El Elíseo, en cambio, no es el destino común, sino un privilegio excepcional que los inmortales conceden a Menelao por ser yerno de Zeus. Ni siquiera Aquiles, hijo de una diosa, tiene carnet de socio; tampoco Agamenón ni el propio Odiseo.</w:t>
-      </w:r>
-    </w:p>
-  </w:footnote>
-  <w:footnote w:id="26">
-    <w:p>
-      <w:pPr>
-        <w:pStyle w:val="FootnoteText"/>
-      </w:pPr>
-      <w:r>
-        <w:rPr>
-          <w:rStyle w:val="FootnoteReference"/>
-        </w:rPr>
-        <w:footnoteRef/>
-      </w:r>
-      <w:r>
-        <w:t xml:space="preserve"> </w:t>
-      </w:r>
-      <w:r>
-        <w:t xml:space="preserve">La traducción de los versos que siguen es mía. Para no tener que compararme con Tobal, opto por los muy sufridos y castellanos endecasílabos.</w:t>
-      </w:r>
-    </w:p>
-  </w:footnote>
-  <w:footnote w:id="27">
-    <w:p>
-      <w:pPr>
-        <w:pStyle w:val="FootnoteText"/>
-      </w:pPr>
-      <w:r>
-        <w:rPr>
-          <w:rStyle w:val="FootnoteReference"/>
-        </w:rPr>
-        <w:footnoteRef/>
-      </w:r>
-      <w:r>
-        <w:t xml:space="preserve"> </w:t>
-      </w:r>
-      <w:r>
-        <w:t xml:space="preserve">Zeus es hijo de Cronos y, como buen hijo que es, le ha quitado el trono al padre y lo ha encerrado en lo más hondo del Tártaro.</w:t>
-      </w:r>
-    </w:p>
-  </w:footnote>
-  <w:footnote w:id="28">
-    <w:p>
-      <w:pPr>
-        <w:pStyle w:val="FootnoteText"/>
-      </w:pPr>
-      <w:r>
-        <w:rPr>
-          <w:rStyle w:val="FootnoteReference"/>
-        </w:rPr>
-        <w:footnoteRef/>
-      </w:r>
-      <w:r>
-        <w:t xml:space="preserve"> </w:t>
-      </w:r>
-      <w:r>
-        <w:t xml:space="preserve">La expresión significa literalmente «el dios desde la máquina»; en la práctica, el dios de la grúa. Cuando un dramaturgo se metía en un lío argumental del que no sabía salir, una tentación heredada de las épicas clásicas era resolverlo todo haciendo descender a un dios del cielo —vía una grúa que sujetaba al actor de turno—.</w:t>
       </w:r>
     </w:p>
   </w:footnote>
@@ -29471,7 +30460,64 @@
       <w:r>
         <w:t xml:space="preserve"> </w:t>
       </w:r>
-      <w:hyperlink r:id="rId12">
+      <w:r>
+        <w:t xml:space="preserve">La traducción de los versos que siguen es mía. Para no tener que compararme con Tobal, opto por los muy sufridos y castellanos endecasílabos.</w:t>
+      </w:r>
+    </w:p>
+  </w:footnote>
+  <w:footnote w:id="30">
+    <w:p>
+      <w:pPr>
+        <w:pStyle w:val="FootnoteText"/>
+      </w:pPr>
+      <w:r>
+        <w:rPr>
+          <w:rStyle w:val="FootnoteReference"/>
+        </w:rPr>
+        <w:footnoteRef/>
+      </w:r>
+      <w:r>
+        <w:t xml:space="preserve"> </w:t>
+      </w:r>
+      <w:r>
+        <w:t xml:space="preserve">Zeus es hijo de Cronos y, como buen hijo que es, le ha quitado el trono al padre y lo ha encerrado en lo más hondo del Tártaro.</w:t>
+      </w:r>
+    </w:p>
+  </w:footnote>
+  <w:footnote w:id="31">
+    <w:p>
+      <w:pPr>
+        <w:pStyle w:val="FootnoteText"/>
+      </w:pPr>
+      <w:r>
+        <w:rPr>
+          <w:rStyle w:val="FootnoteReference"/>
+        </w:rPr>
+        <w:footnoteRef/>
+      </w:r>
+      <w:r>
+        <w:t xml:space="preserve"> </w:t>
+      </w:r>
+      <w:r>
+        <w:t xml:space="preserve">La expresión significa literalmente «el dios desde la máquina»; en la práctica, el dios de la grúa. Cuando un dramaturgo se metía en un lío argumental del que no sabía salir, una tentación heredada de las épicas clásicas era resolverlo todo haciendo descender a un dios del cielo —vía una grúa que sujetaba al actor de turno—.</w:t>
+      </w:r>
+    </w:p>
+  </w:footnote>
+  <w:footnote w:id="32">
+    <w:p>
+      <w:pPr>
+        <w:pStyle w:val="FootnoteText"/>
+      </w:pPr>
+      <w:r>
+        <w:rPr>
+          <w:rStyle w:val="FootnoteReference"/>
+        </w:rPr>
+        <w:footnoteRef/>
+      </w:r>
+      <w:r>
+        <w:t xml:space="preserve"> </w:t>
+      </w:r>
+      <w:hyperlink r:id="rId15">
         <w:r>
           <w:rPr>
             <w:rStyle w:val="Hyperlink"/>
@@ -29481,7 +30527,7 @@
       </w:hyperlink>
     </w:p>
   </w:footnote>
-  <w:footnote w:id="31">
+  <w:footnote w:id="34">
     <w:p>
       <w:pPr>
         <w:pStyle w:val="FootnoteText"/>
@@ -29495,7 +30541,7 @@
       <w:r>
         <w:t xml:space="preserve"> </w:t>
       </w:r>
-      <w:hyperlink r:id="rId12">
+      <w:hyperlink r:id="rId15">
         <w:r>
           <w:rPr>
             <w:rStyle w:val="Hyperlink"/>
@@ -29505,7 +30551,7 @@
       </w:hyperlink>
     </w:p>
   </w:footnote>
-  <w:footnote w:id="34">
+  <w:footnote w:id="37">
     <w:p>
       <w:pPr>
         <w:pStyle w:val="FootnoteText"/>
@@ -29519,7 +30565,7 @@
       <w:r>
         <w:t xml:space="preserve"> </w:t>
       </w:r>
-      <w:hyperlink r:id="rId12">
+      <w:hyperlink r:id="rId15">
         <w:r>
           <w:rPr>
             <w:rStyle w:val="Hyperlink"/>
@@ -29529,7 +30575,7 @@
       </w:hyperlink>
     </w:p>
   </w:footnote>
-  <w:footnote w:id="37">
+  <w:footnote w:id="40">
     <w:p>
       <w:pPr>
         <w:pStyle w:val="FootnoteText"/>
@@ -29561,7 +30607,7 @@
       </w:r>
     </w:p>
   </w:footnote>
-  <w:footnote w:id="38">
+  <w:footnote w:id="41">
     <w:p>
       <w:pPr>
         <w:pStyle w:val="FootnoteText"/>
@@ -29580,7 +30626,7 @@
       </w:r>
     </w:p>
   </w:footnote>
-  <w:footnote w:id="39">
+  <w:footnote w:id="42">
     <w:p>
       <w:pPr>
         <w:pStyle w:val="FootnoteText"/>
@@ -29613,7 +30659,7 @@
       <w:r>
         <w:t xml:space="preserve">(</w:t>
       </w:r>
-      <w:hyperlink r:id="rId12">
+      <w:hyperlink r:id="rId15">
         <w:r>
           <w:rPr>
             <w:rStyle w:val="Hyperlink"/>
@@ -29626,7 +30672,7 @@
       </w:r>
     </w:p>
   </w:footnote>
-  <w:footnote w:id="41">
+  <w:footnote w:id="44">
     <w:p>
       <w:pPr>
         <w:pStyle w:val="FootnoteText"/>
@@ -29640,7 +30686,7 @@
       <w:r>
         <w:t xml:space="preserve"> </w:t>
       </w:r>
-      <w:hyperlink r:id="rId12">
+      <w:hyperlink r:id="rId15">
         <w:r>
           <w:rPr>
             <w:rStyle w:val="Hyperlink"/>
@@ -29650,7 +30696,7 @@
       </w:hyperlink>
     </w:p>
   </w:footnote>
-  <w:footnote w:id="42">
+  <w:footnote w:id="45">
     <w:p>
       <w:pPr>
         <w:pStyle w:val="FootnoteText"/>
@@ -29669,7 +30715,7 @@
       </w:r>
     </w:p>
   </w:footnote>
-  <w:footnote w:id="44">
+  <w:footnote w:id="47">
     <w:p>
       <w:pPr>
         <w:pStyle w:val="FootnoteText"/>
@@ -29704,7 +30750,7 @@
       </w:r>
     </w:p>
   </w:footnote>
-  <w:footnote w:id="45">
+  <w:footnote w:id="48">
     <w:p>
       <w:pPr>
         <w:pStyle w:val="FootnoteText"/>
@@ -29723,7 +30769,7 @@
       </w:r>
     </w:p>
   </w:footnote>
-  <w:footnote w:id="46">
+  <w:footnote w:id="49">
     <w:p>
       <w:pPr>
         <w:pStyle w:val="FootnoteText"/>
@@ -29773,7 +30819,7 @@
       </w:r>
     </w:p>
   </w:footnote>
-  <w:footnote w:id="47">
+  <w:footnote w:id="50">
     <w:p>
       <w:pPr>
         <w:pStyle w:val="FootnoteText"/>
@@ -29800,7 +30846,7 @@
       <w:r>
         <w:t xml:space="preserve"> </w:t>
       </w:r>
-      <w:hyperlink r:id="rId12">
+      <w:hyperlink r:id="rId15">
         <w:r>
           <w:rPr>
             <w:rStyle w:val="Hyperlink"/>
@@ -29813,7 +30859,7 @@
       </w:r>
     </w:p>
   </w:footnote>
-  <w:footnote w:id="49">
+  <w:footnote w:id="52">
     <w:p>
       <w:pPr>
         <w:pStyle w:val="FootnoteText"/>
@@ -29864,7 +30910,7 @@
       </w:r>
     </w:p>
   </w:footnote>
-  <w:footnote w:id="50">
+  <w:footnote w:id="53">
     <w:p>
       <w:pPr>
         <w:pStyle w:val="FootnoteText"/>
@@ -29878,7 +30924,7 @@
       <w:r>
         <w:t xml:space="preserve"> </w:t>
       </w:r>
-      <w:hyperlink r:id="rId12">
+      <w:hyperlink r:id="rId15">
         <w:r>
           <w:rPr>
             <w:rStyle w:val="Hyperlink"/>
@@ -29888,7 +30934,7 @@
       </w:hyperlink>
     </w:p>
   </w:footnote>
-  <w:footnote w:id="51">
+  <w:footnote w:id="54">
     <w:p>
       <w:pPr>
         <w:pStyle w:val="FootnoteText"/>
@@ -29907,7 +30953,7 @@
       </w:r>
     </w:p>
   </w:footnote>
-  <w:footnote w:id="53">
+  <w:footnote w:id="56">
     <w:p>
       <w:pPr>
         <w:pStyle w:val="FootnoteText"/>
@@ -29921,7 +30967,7 @@
       <w:r>
         <w:t xml:space="preserve"> </w:t>
       </w:r>
-      <w:hyperlink r:id="rId12">
+      <w:hyperlink r:id="rId15">
         <w:r>
           <w:rPr>
             <w:rStyle w:val="Hyperlink"/>
@@ -29931,7 +30977,7 @@
       </w:hyperlink>
     </w:p>
   </w:footnote>
-  <w:footnote w:id="58">
+  <w:footnote w:id="61">
     <w:p>
       <w:pPr>
         <w:pStyle w:val="FootnoteText"/>
@@ -29964,7 +31010,7 @@
       <w:r>
         <w:t xml:space="preserve"> </w:t>
       </w:r>
-      <w:hyperlink r:id="rId59">
+      <w:hyperlink r:id="rId62">
         <w:r>
           <w:rPr>
             <w:rStyle w:val="Hyperlink"/>
@@ -29974,7 +31020,7 @@
       </w:hyperlink>
     </w:p>
   </w:footnote>
-  <w:footnote w:id="60">
+  <w:footnote w:id="63">
     <w:p>
       <w:pPr>
         <w:pStyle w:val="FootnoteText"/>

</xml_diff>